<commit_message>
Added title pages to design documents.
</commit_message>
<xml_diff>
--- a/Design & Documents/Work Breakdown.docx
+++ b/Design & Documents/Work Breakdown.docx
@@ -1,112 +1,391 @@
 
 <file path=word/document.xml><?xml version="1.0" encoding="utf-8"?>
-<w:document xmlns:wpc="http://schemas.microsoft.com/office/word/2010/wordprocessingCanvas" xmlns:mc="http://schemas.openxmlformats.org/markup-compatibility/2006" xmlns:o="urn:schemas-microsoft-com:office:office" xmlns:r="http://schemas.openxmlformats.org/officeDocument/2006/relationships" xmlns:m="http://schemas.openxmlformats.org/officeDocument/2006/math" xmlns:v="urn:schemas-microsoft-com:vml" xmlns:wp14="http://schemas.microsoft.com/office/word/2010/wordprocessingDrawing" xmlns:wp="http://schemas.openxmlformats.org/drawingml/2006/wordprocessingDrawing" xmlns:w10="urn:schemas-microsoft-com:office:word" xmlns:w="http://schemas.openxmlformats.org/wordprocessingml/2006/main" xmlns:w14="http://schemas.microsoft.com/office/word/2010/wordml" xmlns:w15="http://schemas.microsoft.com/office/word/2012/wordml" xmlns:wpg="http://schemas.microsoft.com/office/word/2010/wordprocessingGroup" xmlns:wpi="http://schemas.microsoft.com/office/word/2010/wordprocessingInk" xmlns:wne="http://schemas.microsoft.com/office/word/2006/wordml" xmlns:wps="http://schemas.microsoft.com/office/word/2010/wordprocessingShape" mc:Ignorable="w14 w15 wp14">
+<w:document xmlns:ve="http://schemas.openxmlformats.org/markup-compatibility/2006" xmlns:o="urn:schemas-microsoft-com:office:office" xmlns:r="http://schemas.openxmlformats.org/officeDocument/2006/relationships" xmlns:m="http://schemas.openxmlformats.org/officeDocument/2006/math" xmlns:v="urn:schemas-microsoft-com:vml" xmlns:wp="http://schemas.openxmlformats.org/drawingml/2006/wordprocessingDrawing" xmlns:w10="urn:schemas-microsoft-com:office:word" xmlns:w="http://schemas.openxmlformats.org/wordprocessingml/2006/main" xmlns:wne="http://schemas.microsoft.com/office/word/2006/wordml">
   <w:body>
-    <w:p>
-      <w:pPr>
-        <w:pStyle w:val="Title"/>
-        <w:jc w:val="center"/>
-      </w:pPr>
-      <w:r>
-        <w:t>Data Communications</w:t>
-      </w:r>
-    </w:p>
-    <w:p>
-      <w:pPr>
-        <w:pStyle w:val="Title"/>
-        <w:jc w:val="center"/>
-      </w:pPr>
-      <w:r>
-        <w:t xml:space="preserve">Assignment </w:t>
-      </w:r>
-      <w:r>
-        <w:t>4</w:t>
-      </w:r>
-      <w:r>
-        <w:t xml:space="preserve"> - Design</w:t>
-      </w:r>
-    </w:p>
-    <w:p>
-      <w:pPr>
-        <w:pStyle w:val="Heading1"/>
-        <w:jc w:val="center"/>
-      </w:pPr>
-      <w:bookmarkStart w:id="0" w:name="_Toc403716930"/>
-      <w:bookmarkStart w:id="1" w:name="_Toc403717322"/>
-      <w:r>
-        <w:t>Lewis Scott – A00855385 – Set 3O</w:t>
-      </w:r>
-      <w:bookmarkEnd w:id="0"/>
-      <w:bookmarkEnd w:id="1"/>
-    </w:p>
-    <w:p>
-      <w:pPr>
-        <w:pStyle w:val="Heading1"/>
-        <w:jc w:val="center"/>
-      </w:pPr>
-      <w:bookmarkStart w:id="2" w:name="_Toc400292400"/>
-      <w:bookmarkStart w:id="3" w:name="_Toc400706064"/>
-      <w:bookmarkStart w:id="4" w:name="_Toc403716931"/>
-      <w:bookmarkStart w:id="5" w:name="_Toc403717323"/>
-      <w:proofErr w:type="spellStart"/>
-      <w:r>
-        <w:t>Christofer</w:t>
-      </w:r>
-      <w:proofErr w:type="spellEnd"/>
-      <w:r>
-        <w:t xml:space="preserve"> Klassen – A00879060 – Set 3O</w:t>
-      </w:r>
-      <w:bookmarkEnd w:id="2"/>
-      <w:bookmarkEnd w:id="3"/>
-      <w:bookmarkEnd w:id="4"/>
-      <w:bookmarkEnd w:id="5"/>
-    </w:p>
-    <w:p>
-      <w:pPr>
-        <w:pStyle w:val="Heading1"/>
-        <w:jc w:val="center"/>
-      </w:pPr>
-      <w:bookmarkStart w:id="6" w:name="_Toc400292401"/>
-      <w:bookmarkStart w:id="7" w:name="_Toc400706065"/>
-      <w:bookmarkStart w:id="8" w:name="_Toc403716932"/>
-      <w:bookmarkStart w:id="9" w:name="_Toc403717324"/>
-      <w:r>
-        <w:t xml:space="preserve">Jeff </w:t>
-      </w:r>
-      <w:proofErr w:type="spellStart"/>
-      <w:r>
-        <w:t>Bayntun</w:t>
-      </w:r>
-      <w:proofErr w:type="spellEnd"/>
-      <w:r>
-        <w:t xml:space="preserve"> – A00860994 – Set 3O</w:t>
-      </w:r>
-      <w:bookmarkEnd w:id="6"/>
-      <w:bookmarkEnd w:id="7"/>
-      <w:bookmarkEnd w:id="8"/>
-      <w:bookmarkEnd w:id="9"/>
-    </w:p>
-    <w:p>
-      <w:pPr>
-        <w:pStyle w:val="Heading1"/>
-        <w:jc w:val="center"/>
-      </w:pPr>
-      <w:bookmarkStart w:id="10" w:name="_Toc403716933"/>
-      <w:bookmarkStart w:id="11" w:name="_Toc403717325"/>
-      <w:r>
-        <w:t xml:space="preserve">Thomas </w:t>
-      </w:r>
-      <w:proofErr w:type="spellStart"/>
-      <w:r>
-        <w:t>Tallentire</w:t>
-      </w:r>
-      <w:proofErr w:type="spellEnd"/>
-      <w:r>
-        <w:t xml:space="preserve"> – A00000000 – Set 3O</w:t>
-      </w:r>
-      <w:bookmarkEnd w:id="10"/>
-      <w:bookmarkEnd w:id="11"/>
-    </w:p>
+    <w:sdt>
+      <w:sdtPr>
+        <w:rPr>
+          <w:rFonts w:asciiTheme="majorHAnsi" w:eastAsiaTheme="majorEastAsia" w:hAnsiTheme="majorHAnsi" w:cstheme="majorBidi"/>
+          <w:caps/>
+        </w:rPr>
+        <w:id w:val="86648686"/>
+        <w:docPartObj>
+          <w:docPartGallery w:val="Cover Pages"/>
+          <w:docPartUnique/>
+        </w:docPartObj>
+      </w:sdtPr>
+      <w:sdtEndPr>
+        <w:rPr>
+          <w:rFonts w:asciiTheme="minorHAnsi" w:eastAsiaTheme="minorEastAsia" w:hAnsiTheme="minorHAnsi" w:cstheme="minorBidi"/>
+          <w:caps w:val="0"/>
+        </w:rPr>
+      </w:sdtEndPr>
+      <w:sdtContent>
+        <w:tbl>
+          <w:tblPr>
+            <w:tblW w:w="5000" w:type="pct"/>
+            <w:jc w:val="center"/>
+            <w:tblLook w:val="04A0"/>
+          </w:tblPr>
+          <w:tblGrid>
+            <w:gridCol w:w="9576"/>
+          </w:tblGrid>
+          <w:tr>
+            <w:trPr>
+              <w:trHeight w:val="2880"/>
+              <w:jc w:val="center"/>
+            </w:trPr>
+            <w:sdt>
+              <w:sdtPr>
+                <w:rPr>
+                  <w:rFonts w:asciiTheme="majorHAnsi" w:eastAsiaTheme="majorEastAsia" w:hAnsiTheme="majorHAnsi" w:cstheme="majorBidi"/>
+                  <w:caps/>
+                </w:rPr>
+                <w:alias w:val="Company"/>
+                <w:id w:val="15524243"/>
+                <w:placeholder>
+                  <w:docPart w:val="8C35D953F0D442758A57F7720D14363B"/>
+                </w:placeholder>
+                <w:dataBinding w:prefixMappings="xmlns:ns0='http://schemas.openxmlformats.org/officeDocument/2006/extended-properties'" w:xpath="/ns0:Properties[1]/ns0:Company[1]" w:storeItemID="{6668398D-A668-4E3E-A5EB-62B293D839F1}"/>
+                <w:text/>
+              </w:sdtPr>
+              <w:sdtEndPr/>
+              <w:sdtContent>
+                <w:tc>
+                  <w:tcPr>
+                    <w:tcW w:w="5000" w:type="pct"/>
+                  </w:tcPr>
+                  <w:p>
+                    <w:pPr>
+                      <w:pStyle w:val="NoSpacing"/>
+                      <w:jc w:val="center"/>
+                      <w:rPr>
+                        <w:rFonts w:asciiTheme="majorHAnsi" w:eastAsiaTheme="majorEastAsia" w:hAnsiTheme="majorHAnsi" w:cstheme="majorBidi"/>
+                        <w:caps/>
+                      </w:rPr>
+                    </w:pPr>
+                    <w:r>
+                      <w:rPr>
+                        <w:rFonts w:asciiTheme="majorHAnsi" w:eastAsiaTheme="majorEastAsia" w:hAnsiTheme="majorHAnsi" w:cstheme="majorBidi"/>
+                        <w:caps/>
+                      </w:rPr>
+                      <w:t>COMP 3980</w:t>
+                    </w:r>
+                  </w:p>
+                </w:tc>
+              </w:sdtContent>
+            </w:sdt>
+          </w:tr>
+          <w:tr>
+            <w:trPr>
+              <w:trHeight w:val="1440"/>
+              <w:jc w:val="center"/>
+            </w:trPr>
+            <w:sdt>
+              <w:sdtPr>
+                <w:rPr>
+                  <w:rFonts w:asciiTheme="majorHAnsi" w:eastAsiaTheme="majorEastAsia" w:hAnsiTheme="majorHAnsi" w:cstheme="majorBidi"/>
+                  <w:sz w:val="80"/>
+                  <w:szCs w:val="80"/>
+                </w:rPr>
+                <w:alias w:val="Title"/>
+                <w:id w:val="15524250"/>
+                <w:placeholder>
+                  <w:docPart w:val="7F64B2AD64114EA7B5FD54AC2C2D5493"/>
+                </w:placeholder>
+                <w:dataBinding w:prefixMappings="xmlns:ns0='http://schemas.openxmlformats.org/package/2006/metadata/core-properties' xmlns:ns1='http://purl.org/dc/elements/1.1/'" w:xpath="/ns0:coreProperties[1]/ns1:title[1]" w:storeItemID="{6C3C8BC8-F283-45AE-878A-BAB7291924A1}"/>
+                <w:text/>
+              </w:sdtPr>
+              <w:sdtContent>
+                <w:tc>
+                  <w:tcPr>
+                    <w:tcW w:w="5000" w:type="pct"/>
+                    <w:tcBorders>
+                      <w:bottom w:val="single" w:sz="4" w:space="0" w:color="F07F09" w:themeColor="accent1"/>
+                    </w:tcBorders>
+                    <w:vAlign w:val="center"/>
+                  </w:tcPr>
+                  <w:p>
+                    <w:pPr>
+                      <w:pStyle w:val="NoSpacing"/>
+                      <w:jc w:val="center"/>
+                      <w:rPr>
+                        <w:rFonts w:asciiTheme="majorHAnsi" w:eastAsiaTheme="majorEastAsia" w:hAnsiTheme="majorHAnsi" w:cstheme="majorBidi"/>
+                        <w:sz w:val="80"/>
+                        <w:szCs w:val="80"/>
+                      </w:rPr>
+                    </w:pPr>
+                    <w:r>
+                      <w:rPr>
+                        <w:rFonts w:asciiTheme="majorHAnsi" w:eastAsiaTheme="majorEastAsia" w:hAnsiTheme="majorHAnsi" w:cstheme="majorBidi"/>
+                        <w:sz w:val="80"/>
+                        <w:szCs w:val="80"/>
+                      </w:rPr>
+                      <w:t>Data Comm Assignment 4  Design</w:t>
+                    </w:r>
+                  </w:p>
+                </w:tc>
+              </w:sdtContent>
+            </w:sdt>
+          </w:tr>
+          <w:tr>
+            <w:trPr>
+              <w:trHeight w:val="720"/>
+              <w:jc w:val="center"/>
+            </w:trPr>
+            <w:sdt>
+              <w:sdtPr>
+                <w:rPr>
+                  <w:rFonts w:asciiTheme="majorHAnsi" w:eastAsiaTheme="majorEastAsia" w:hAnsiTheme="majorHAnsi" w:cstheme="majorBidi"/>
+                  <w:sz w:val="44"/>
+                  <w:szCs w:val="44"/>
+                </w:rPr>
+                <w:alias w:val="Subtitle"/>
+                <w:id w:val="15524255"/>
+                <w:placeholder>
+                  <w:docPart w:val="3F999BE63CD04C79A55A40D73867033F"/>
+                </w:placeholder>
+                <w:dataBinding w:prefixMappings="xmlns:ns0='http://schemas.openxmlformats.org/package/2006/metadata/core-properties' xmlns:ns1='http://purl.org/dc/elements/1.1/'" w:xpath="/ns0:coreProperties[1]/ns1:subject[1]" w:storeItemID="{6C3C8BC8-F283-45AE-878A-BAB7291924A1}"/>
+                <w:text/>
+              </w:sdtPr>
+              <w:sdtContent>
+                <w:tc>
+                  <w:tcPr>
+                    <w:tcW w:w="5000" w:type="pct"/>
+                    <w:tcBorders>
+                      <w:top w:val="single" w:sz="4" w:space="0" w:color="F07F09" w:themeColor="accent1"/>
+                    </w:tcBorders>
+                    <w:vAlign w:val="center"/>
+                  </w:tcPr>
+                  <w:p>
+                    <w:pPr>
+                      <w:pStyle w:val="NoSpacing"/>
+                      <w:jc w:val="center"/>
+                      <w:rPr>
+                        <w:rFonts w:asciiTheme="majorHAnsi" w:eastAsiaTheme="majorEastAsia" w:hAnsiTheme="majorHAnsi" w:cstheme="majorBidi"/>
+                        <w:sz w:val="44"/>
+                        <w:szCs w:val="44"/>
+                      </w:rPr>
+                    </w:pPr>
+                    <w:r>
+                      <w:rPr>
+                        <w:rFonts w:asciiTheme="majorHAnsi" w:eastAsiaTheme="majorEastAsia" w:hAnsiTheme="majorHAnsi" w:cstheme="majorBidi"/>
+                        <w:sz w:val="44"/>
+                        <w:szCs w:val="44"/>
+                      </w:rPr>
+                      <w:t>An implementation of the Grapefruit Protocol</w:t>
+                    </w:r>
+                  </w:p>
+                </w:tc>
+              </w:sdtContent>
+            </w:sdt>
+          </w:tr>
+          <w:tr>
+            <w:trPr>
+              <w:trHeight w:val="360"/>
+              <w:jc w:val="center"/>
+            </w:trPr>
+            <w:tc>
+              <w:tcPr>
+                <w:tcW w:w="5000" w:type="pct"/>
+                <w:vAlign w:val="center"/>
+              </w:tcPr>
+              <w:p>
+                <w:pPr>
+                  <w:pStyle w:val="NoSpacing"/>
+                  <w:jc w:val="center"/>
+                </w:pPr>
+              </w:p>
+            </w:tc>
+          </w:tr>
+          <w:tr>
+            <w:trPr>
+              <w:trHeight w:val="360"/>
+              <w:jc w:val="center"/>
+            </w:trPr>
+            <w:sdt>
+              <w:sdtPr>
+                <w:rPr>
+                  <w:b/>
+                  <w:bCs/>
+                </w:rPr>
+                <w:alias w:val="Author"/>
+                <w:id w:val="15524260"/>
+                <w:placeholder>
+                  <w:docPart w:val="024CEE8A25B342488081DE2D78E0421A"/>
+                </w:placeholder>
+                <w:dataBinding w:prefixMappings="xmlns:ns0='http://schemas.openxmlformats.org/package/2006/metadata/core-properties' xmlns:ns1='http://purl.org/dc/elements/1.1/'" w:xpath="/ns0:coreProperties[1]/ns1:creator[1]" w:storeItemID="{6C3C8BC8-F283-45AE-878A-BAB7291924A1}"/>
+                <w:text/>
+              </w:sdtPr>
+              <w:sdtContent>
+                <w:tc>
+                  <w:tcPr>
+                    <w:tcW w:w="5000" w:type="pct"/>
+                    <w:vAlign w:val="center"/>
+                  </w:tcPr>
+                  <w:p>
+                    <w:pPr>
+                      <w:pStyle w:val="NoSpacing"/>
+                      <w:jc w:val="center"/>
+                      <w:rPr>
+                        <w:b/>
+                        <w:bCs/>
+                      </w:rPr>
+                    </w:pPr>
+                    <w:r>
+                      <w:rPr>
+                        <w:b/>
+                        <w:bCs/>
+                      </w:rPr>
+                      <w:t>Lewis Scott - A00855385</w:t>
+                    </w:r>
+                  </w:p>
+                </w:tc>
+              </w:sdtContent>
+            </w:sdt>
+          </w:tr>
+          <w:tr>
+            <w:trPr>
+              <w:trHeight w:val="360"/>
+              <w:jc w:val="center"/>
+            </w:trPr>
+            <w:tc>
+              <w:tcPr>
+                <w:tcW w:w="5000" w:type="pct"/>
+                <w:vAlign w:val="center"/>
+              </w:tcPr>
+              <w:p>
+                <w:pPr>
+                  <w:pStyle w:val="NoSpacing"/>
+                  <w:jc w:val="center"/>
+                  <w:rPr>
+                    <w:b/>
+                    <w:bCs/>
+                  </w:rPr>
+                </w:pPr>
+                <w:r>
+                  <w:rPr>
+                    <w:b/>
+                    <w:bCs/>
+                  </w:rPr>
+                  <w:t>Christofer Klassen - A00879060</w:t>
+                </w:r>
+              </w:p>
+            </w:tc>
+          </w:tr>
+          <w:tr>
+            <w:trPr>
+              <w:trHeight w:val="360"/>
+              <w:jc w:val="center"/>
+            </w:trPr>
+            <w:tc>
+              <w:tcPr>
+                <w:tcW w:w="5000" w:type="pct"/>
+                <w:vAlign w:val="center"/>
+              </w:tcPr>
+              <w:p>
+                <w:pPr>
+                  <w:pStyle w:val="NoSpacing"/>
+                  <w:jc w:val="center"/>
+                  <w:rPr>
+                    <w:b/>
+                    <w:bCs/>
+                  </w:rPr>
+                </w:pPr>
+                <w:r>
+                  <w:rPr>
+                    <w:b/>
+                    <w:bCs/>
+                  </w:rPr>
+                  <w:t>Jeff Bayntun - A00860994</w:t>
+                </w:r>
+              </w:p>
+            </w:tc>
+          </w:tr>
+          <w:tr>
+            <w:trPr>
+              <w:trHeight w:val="360"/>
+              <w:jc w:val="center"/>
+            </w:trPr>
+            <w:tc>
+              <w:tcPr>
+                <w:tcW w:w="5000" w:type="pct"/>
+                <w:vAlign w:val="center"/>
+              </w:tcPr>
+              <w:p>
+                <w:pPr>
+                  <w:pStyle w:val="NoSpacing"/>
+                  <w:jc w:val="center"/>
+                  <w:rPr>
+                    <w:b/>
+                    <w:bCs/>
+                  </w:rPr>
+                </w:pPr>
+                <w:r>
+                  <w:rPr>
+                    <w:b/>
+                    <w:bCs/>
+                  </w:rPr>
+                  <w:t>Thomas Tallentire - A00</w:t>
+                </w:r>
+              </w:p>
+            </w:tc>
+          </w:tr>
+          <w:tr>
+            <w:trPr>
+              <w:trHeight w:val="360"/>
+              <w:jc w:val="center"/>
+            </w:trPr>
+            <w:tc>
+              <w:tcPr>
+                <w:tcW w:w="5000" w:type="pct"/>
+                <w:vAlign w:val="center"/>
+              </w:tcPr>
+              <w:p>
+                <w:pPr>
+                  <w:pStyle w:val="NoSpacing"/>
+                  <w:jc w:val="center"/>
+                  <w:rPr>
+                    <w:b/>
+                    <w:bCs/>
+                  </w:rPr>
+                </w:pPr>
+              </w:p>
+            </w:tc>
+          </w:tr>
+        </w:tbl>
+        <w:p/>
+        <w:p/>
+        <w:tbl>
+          <w:tblPr>
+            <w:tblpPr w:leftFromText="187" w:rightFromText="187" w:horzAnchor="margin" w:tblpXSpec="center" w:tblpYSpec="bottom"/>
+            <w:tblW w:w="5000" w:type="pct"/>
+            <w:tblLook w:val="04A0"/>
+          </w:tblPr>
+          <w:tblGrid>
+            <w:gridCol w:w="9576"/>
+          </w:tblGrid>
+          <w:tr>
+            <w:tc>
+              <w:tcPr>
+                <w:tcW w:w="5000" w:type="pct"/>
+              </w:tcPr>
+              <w:p>
+                <w:pPr>
+                  <w:pStyle w:val="NoSpacing"/>
+                </w:pPr>
+              </w:p>
+            </w:tc>
+          </w:tr>
+        </w:tbl>
+        <w:p/>
+        <w:p>
+          <w:r>
+            <w:br w:type="page"/>
+          </w:r>
+        </w:p>
+      </w:sdtContent>
+    </w:sdt>
     <w:sdt>
       <w:sdtPr>
         <w:rPr>
@@ -733,7 +1012,7 @@
       <w:pPr>
         <w:rPr>
           <w:rFonts w:asciiTheme="majorHAnsi" w:eastAsiaTheme="majorEastAsia" w:hAnsiTheme="majorHAnsi" w:cstheme="majorBidi"/>
-          <w:color w:val="729928" w:themeColor="accent1" w:themeShade="BF"/>
+          <w:color w:val="B35E06" w:themeColor="accent1" w:themeShade="BF"/>
           <w:sz w:val="36"/>
           <w:szCs w:val="36"/>
         </w:rPr>
@@ -741,7 +1020,7 @@
       <w:r>
         <w:rPr>
           <w:rFonts w:asciiTheme="majorHAnsi" w:eastAsiaTheme="majorEastAsia" w:hAnsiTheme="majorHAnsi" w:cstheme="majorBidi"/>
-          <w:color w:val="729928" w:themeColor="accent1" w:themeShade="BF"/>
+          <w:color w:val="B35E06" w:themeColor="accent1" w:themeShade="BF"/>
           <w:sz w:val="36"/>
           <w:szCs w:val="36"/>
         </w:rPr>
@@ -752,23 +1031,23 @@
       <w:pPr>
         <w:pStyle w:val="Heading1"/>
       </w:pPr>
-      <w:bookmarkStart w:id="12" w:name="_Toc403717326"/>
+      <w:bookmarkStart w:id="0" w:name="_Toc403717326"/>
       <w:r>
         <w:lastRenderedPageBreak/>
         <w:t>Timeline</w:t>
       </w:r>
-      <w:bookmarkEnd w:id="12"/>
+      <w:bookmarkEnd w:id="0"/>
     </w:p>
     <w:p/>
     <w:p>
       <w:pPr>
         <w:pStyle w:val="Heading2"/>
       </w:pPr>
-      <w:bookmarkStart w:id="13" w:name="_Toc403717327"/>
+      <w:bookmarkStart w:id="1" w:name="_Toc403717327"/>
       <w:r>
         <w:t>Week of November 17, 2014</w:t>
       </w:r>
-      <w:bookmarkEnd w:id="13"/>
+      <w:bookmarkEnd w:id="1"/>
     </w:p>
     <w:p/>
     <w:p>
@@ -911,8 +1190,8 @@
       <w:r>
         <w:t>Packet creation</w:t>
       </w:r>
-      <w:bookmarkStart w:id="14" w:name="_GoBack"/>
-      <w:bookmarkEnd w:id="14"/>
+      <w:bookmarkStart w:id="2" w:name="_GoBack"/>
+      <w:bookmarkEnd w:id="2"/>
     </w:p>
     <w:p>
       <w:pPr>
@@ -967,11 +1246,11 @@
       <w:pPr>
         <w:pStyle w:val="Heading2"/>
       </w:pPr>
-      <w:bookmarkStart w:id="15" w:name="_Toc403717328"/>
+      <w:bookmarkStart w:id="3" w:name="_Toc403717328"/>
       <w:r>
         <w:t>Week of November 24, 2014</w:t>
       </w:r>
-      <w:bookmarkEnd w:id="15"/>
+      <w:bookmarkEnd w:id="3"/>
     </w:p>
     <w:p/>
     <w:p>
@@ -1070,22 +1349,22 @@
       <w:pPr>
         <w:pStyle w:val="Heading1"/>
       </w:pPr>
-      <w:bookmarkStart w:id="16" w:name="_Toc403717329"/>
+      <w:bookmarkStart w:id="4" w:name="_Toc403717329"/>
       <w:r>
         <w:t>Work Breakdown</w:t>
       </w:r>
-      <w:bookmarkEnd w:id="16"/>
+      <w:bookmarkEnd w:id="4"/>
     </w:p>
     <w:p/>
     <w:p>
       <w:pPr>
         <w:pStyle w:val="Heading2"/>
       </w:pPr>
-      <w:bookmarkStart w:id="17" w:name="_Toc403717330"/>
+      <w:bookmarkStart w:id="5" w:name="_Toc403717330"/>
       <w:r>
         <w:t>Lewis Scott</w:t>
       </w:r>
-      <w:bookmarkEnd w:id="17"/>
+      <w:bookmarkEnd w:id="5"/>
     </w:p>
     <w:p/>
     <w:p>
@@ -1096,13 +1375,8 @@
           <w:numId w:val="18"/>
         </w:numPr>
       </w:pPr>
-      <w:proofErr w:type="spellStart"/>
-      <w:r>
-        <w:t>Comm</w:t>
-      </w:r>
-      <w:proofErr w:type="spellEnd"/>
-      <w:r>
-        <w:t xml:space="preserve"> port setup</w:t>
+      <w:r>
+        <w:t>Comm port setup</w:t>
       </w:r>
     </w:p>
     <w:p>
@@ -1159,16 +1433,11 @@
       <w:pPr>
         <w:pStyle w:val="Heading2"/>
       </w:pPr>
-      <w:bookmarkStart w:id="18" w:name="_Toc403717331"/>
-      <w:proofErr w:type="spellStart"/>
-      <w:r>
-        <w:t>Christofer</w:t>
-      </w:r>
-      <w:proofErr w:type="spellEnd"/>
-      <w:r>
-        <w:t xml:space="preserve"> Klassen</w:t>
-      </w:r>
-      <w:bookmarkEnd w:id="18"/>
+      <w:bookmarkStart w:id="6" w:name="_Toc403717331"/>
+      <w:r>
+        <w:t>Christofer Klassen</w:t>
+      </w:r>
+      <w:bookmarkEnd w:id="6"/>
     </w:p>
     <w:p/>
     <w:p>
@@ -1224,16 +1493,11 @@
       <w:pPr>
         <w:pStyle w:val="Heading2"/>
       </w:pPr>
-      <w:bookmarkStart w:id="19" w:name="_Toc403717332"/>
-      <w:r>
-        <w:t xml:space="preserve">Jeff </w:t>
-      </w:r>
-      <w:proofErr w:type="spellStart"/>
-      <w:r>
-        <w:t>Bayntun</w:t>
-      </w:r>
-      <w:bookmarkEnd w:id="19"/>
-      <w:proofErr w:type="spellEnd"/>
+      <w:bookmarkStart w:id="7" w:name="_Toc403717332"/>
+      <w:r>
+        <w:t>Jeff Bayntun</w:t>
+      </w:r>
+      <w:bookmarkEnd w:id="7"/>
     </w:p>
     <w:p/>
     <w:p>
@@ -1295,16 +1559,11 @@
       <w:pPr>
         <w:pStyle w:val="Heading2"/>
       </w:pPr>
-      <w:bookmarkStart w:id="20" w:name="_Toc403717333"/>
-      <w:r>
-        <w:t xml:space="preserve">Thomas </w:t>
-      </w:r>
-      <w:proofErr w:type="spellStart"/>
-      <w:r>
-        <w:t>Tallentire</w:t>
-      </w:r>
-      <w:bookmarkEnd w:id="20"/>
-      <w:proofErr w:type="spellEnd"/>
+      <w:bookmarkStart w:id="8" w:name="_Toc403717333"/>
+      <w:r>
+        <w:t>Thomas Tallentire</w:t>
+      </w:r>
+      <w:bookmarkEnd w:id="8"/>
     </w:p>
     <w:p/>
     <w:p>
@@ -1380,7 +1639,7 @@
 </file>
 
 <file path=word/numbering.xml><?xml version="1.0" encoding="utf-8"?>
-<w:numbering xmlns:wpc="http://schemas.microsoft.com/office/word/2010/wordprocessingCanvas" xmlns:mc="http://schemas.openxmlformats.org/markup-compatibility/2006" xmlns:o="urn:schemas-microsoft-com:office:office" xmlns:r="http://schemas.openxmlformats.org/officeDocument/2006/relationships" xmlns:m="http://schemas.openxmlformats.org/officeDocument/2006/math" xmlns:v="urn:schemas-microsoft-com:vml" xmlns:wp14="http://schemas.microsoft.com/office/word/2010/wordprocessingDrawing" xmlns:wp="http://schemas.openxmlformats.org/drawingml/2006/wordprocessingDrawing" xmlns:w10="urn:schemas-microsoft-com:office:word" xmlns:w="http://schemas.openxmlformats.org/wordprocessingml/2006/main" xmlns:w14="http://schemas.microsoft.com/office/word/2010/wordml" xmlns:w15="http://schemas.microsoft.com/office/word/2012/wordml" xmlns:wpg="http://schemas.microsoft.com/office/word/2010/wordprocessingGroup" xmlns:wpi="http://schemas.microsoft.com/office/word/2010/wordprocessingInk" xmlns:wne="http://schemas.microsoft.com/office/word/2006/wordml" xmlns:wps="http://schemas.microsoft.com/office/word/2010/wordprocessingShape" mc:Ignorable="w14 w15 wp14">
+<w:numbering xmlns:ve="http://schemas.openxmlformats.org/markup-compatibility/2006" xmlns:o="urn:schemas-microsoft-com:office:office" xmlns:r="http://schemas.openxmlformats.org/officeDocument/2006/relationships" xmlns:m="http://schemas.openxmlformats.org/officeDocument/2006/math" xmlns:v="urn:schemas-microsoft-com:vml" xmlns:wp="http://schemas.openxmlformats.org/drawingml/2006/wordprocessingDrawing" xmlns:w10="urn:schemas-microsoft-com:office:word" xmlns:w="http://schemas.openxmlformats.org/wordprocessingml/2006/main" xmlns:wne="http://schemas.microsoft.com/office/word/2006/wordml">
   <w:abstractNum w:abstractNumId="0">
     <w:nsid w:val="09FC30B9"/>
     <w:multiLevelType w:val="hybridMultilevel"/>
@@ -2429,7 +2688,7 @@
 </file>
 
 <file path=word/styles.xml><?xml version="1.0" encoding="utf-8"?>
-<w:styles xmlns:mc="http://schemas.openxmlformats.org/markup-compatibility/2006" xmlns:r="http://schemas.openxmlformats.org/officeDocument/2006/relationships" xmlns:w="http://schemas.openxmlformats.org/wordprocessingml/2006/main" xmlns:w14="http://schemas.microsoft.com/office/word/2010/wordml" xmlns:w15="http://schemas.microsoft.com/office/word/2012/wordml" mc:Ignorable="w14 w15">
+<w:styles xmlns:r="http://schemas.openxmlformats.org/officeDocument/2006/relationships" xmlns:w="http://schemas.openxmlformats.org/wordprocessingml/2006/main">
   <w:docDefaults>
     <w:rPrDefault>
       <w:rPr>
@@ -2445,378 +2704,144 @@
       </w:pPr>
     </w:pPrDefault>
   </w:docDefaults>
-  <w:latentStyles w:defLockedState="0" w:defUIPriority="99" w:defSemiHidden="0" w:defUnhideWhenUsed="0" w:defQFormat="0" w:count="371">
-    <w:lsdException w:name="Normal" w:uiPriority="0" w:qFormat="1"/>
-    <w:lsdException w:name="heading 1" w:uiPriority="9" w:qFormat="1"/>
-    <w:lsdException w:name="heading 2" w:semiHidden="1" w:uiPriority="9" w:unhideWhenUsed="1" w:qFormat="1"/>
-    <w:lsdException w:name="heading 3" w:semiHidden="1" w:uiPriority="9" w:unhideWhenUsed="1" w:qFormat="1"/>
-    <w:lsdException w:name="heading 4" w:semiHidden="1" w:uiPriority="9" w:unhideWhenUsed="1" w:qFormat="1"/>
-    <w:lsdException w:name="heading 5" w:semiHidden="1" w:uiPriority="9" w:unhideWhenUsed="1" w:qFormat="1"/>
-    <w:lsdException w:name="heading 6" w:semiHidden="1" w:uiPriority="9" w:unhideWhenUsed="1" w:qFormat="1"/>
-    <w:lsdException w:name="heading 7" w:semiHidden="1" w:uiPriority="9" w:unhideWhenUsed="1" w:qFormat="1"/>
-    <w:lsdException w:name="heading 8" w:semiHidden="1" w:uiPriority="9" w:unhideWhenUsed="1" w:qFormat="1"/>
-    <w:lsdException w:name="heading 9" w:semiHidden="1" w:uiPriority="9" w:unhideWhenUsed="1" w:qFormat="1"/>
-    <w:lsdException w:name="index 1" w:semiHidden="1" w:unhideWhenUsed="1"/>
-    <w:lsdException w:name="index 2" w:semiHidden="1" w:unhideWhenUsed="1"/>
-    <w:lsdException w:name="index 3" w:semiHidden="1" w:unhideWhenUsed="1"/>
-    <w:lsdException w:name="index 4" w:semiHidden="1" w:unhideWhenUsed="1"/>
-    <w:lsdException w:name="index 5" w:semiHidden="1" w:unhideWhenUsed="1"/>
-    <w:lsdException w:name="index 6" w:semiHidden="1" w:unhideWhenUsed="1"/>
-    <w:lsdException w:name="index 7" w:semiHidden="1" w:unhideWhenUsed="1"/>
-    <w:lsdException w:name="index 8" w:semiHidden="1" w:unhideWhenUsed="1"/>
-    <w:lsdException w:name="index 9" w:semiHidden="1" w:unhideWhenUsed="1"/>
-    <w:lsdException w:name="toc 1" w:semiHidden="1" w:uiPriority="39" w:unhideWhenUsed="1"/>
-    <w:lsdException w:name="toc 2" w:semiHidden="1" w:uiPriority="39" w:unhideWhenUsed="1"/>
-    <w:lsdException w:name="toc 3" w:semiHidden="1" w:uiPriority="39" w:unhideWhenUsed="1"/>
-    <w:lsdException w:name="toc 4" w:semiHidden="1" w:uiPriority="39" w:unhideWhenUsed="1"/>
-    <w:lsdException w:name="toc 5" w:semiHidden="1" w:uiPriority="39" w:unhideWhenUsed="1"/>
-    <w:lsdException w:name="toc 6" w:semiHidden="1" w:uiPriority="39" w:unhideWhenUsed="1"/>
-    <w:lsdException w:name="toc 7" w:semiHidden="1" w:uiPriority="39" w:unhideWhenUsed="1"/>
-    <w:lsdException w:name="toc 8" w:semiHidden="1" w:uiPriority="39" w:unhideWhenUsed="1"/>
-    <w:lsdException w:name="toc 9" w:semiHidden="1" w:uiPriority="39" w:unhideWhenUsed="1"/>
-    <w:lsdException w:name="Normal Indent" w:semiHidden="1" w:unhideWhenUsed="1"/>
-    <w:lsdException w:name="footnote text" w:semiHidden="1" w:unhideWhenUsed="1"/>
-    <w:lsdException w:name="annotation text" w:semiHidden="1" w:unhideWhenUsed="1"/>
-    <w:lsdException w:name="header" w:semiHidden="1" w:unhideWhenUsed="1"/>
-    <w:lsdException w:name="footer" w:semiHidden="1" w:unhideWhenUsed="1"/>
-    <w:lsdException w:name="index heading" w:semiHidden="1" w:unhideWhenUsed="1"/>
-    <w:lsdException w:name="caption" w:semiHidden="1" w:uiPriority="35" w:unhideWhenUsed="1" w:qFormat="1"/>
-    <w:lsdException w:name="table of figures" w:semiHidden="1" w:unhideWhenUsed="1"/>
-    <w:lsdException w:name="envelope address" w:semiHidden="1" w:unhideWhenUsed="1"/>
-    <w:lsdException w:name="envelope return" w:semiHidden="1" w:unhideWhenUsed="1"/>
-    <w:lsdException w:name="footnote reference" w:semiHidden="1" w:unhideWhenUsed="1"/>
-    <w:lsdException w:name="annotation reference" w:semiHidden="1" w:unhideWhenUsed="1"/>
-    <w:lsdException w:name="line number" w:semiHidden="1" w:unhideWhenUsed="1"/>
-    <w:lsdException w:name="page number" w:semiHidden="1" w:unhideWhenUsed="1"/>
-    <w:lsdException w:name="endnote reference" w:semiHidden="1" w:unhideWhenUsed="1"/>
-    <w:lsdException w:name="endnote text" w:semiHidden="1" w:unhideWhenUsed="1"/>
-    <w:lsdException w:name="table of authorities" w:semiHidden="1" w:unhideWhenUsed="1"/>
-    <w:lsdException w:name="macro" w:semiHidden="1" w:unhideWhenUsed="1"/>
-    <w:lsdException w:name="toa heading" w:semiHidden="1" w:unhideWhenUsed="1"/>
-    <w:lsdException w:name="List" w:semiHidden="1" w:unhideWhenUsed="1"/>
-    <w:lsdException w:name="List Bullet" w:semiHidden="1" w:unhideWhenUsed="1"/>
-    <w:lsdException w:name="List Number" w:semiHidden="1" w:unhideWhenUsed="1"/>
-    <w:lsdException w:name="List 2" w:semiHidden="1" w:unhideWhenUsed="1"/>
-    <w:lsdException w:name="List 3" w:semiHidden="1" w:unhideWhenUsed="1"/>
-    <w:lsdException w:name="List 4" w:semiHidden="1" w:unhideWhenUsed="1"/>
-    <w:lsdException w:name="List 5" w:semiHidden="1" w:unhideWhenUsed="1"/>
-    <w:lsdException w:name="List Bullet 2" w:semiHidden="1" w:unhideWhenUsed="1"/>
-    <w:lsdException w:name="List Bullet 3" w:semiHidden="1" w:unhideWhenUsed="1"/>
-    <w:lsdException w:name="List Bullet 4" w:semiHidden="1" w:unhideWhenUsed="1"/>
-    <w:lsdException w:name="List Bullet 5" w:semiHidden="1" w:unhideWhenUsed="1"/>
-    <w:lsdException w:name="List Number 2" w:semiHidden="1" w:unhideWhenUsed="1"/>
-    <w:lsdException w:name="List Number 3" w:semiHidden="1" w:unhideWhenUsed="1"/>
-    <w:lsdException w:name="List Number 4" w:semiHidden="1" w:unhideWhenUsed="1"/>
-    <w:lsdException w:name="List Number 5" w:semiHidden="1" w:unhideWhenUsed="1"/>
-    <w:lsdException w:name="Title" w:uiPriority="10" w:qFormat="1"/>
-    <w:lsdException w:name="Closing" w:semiHidden="1" w:unhideWhenUsed="1"/>
-    <w:lsdException w:name="Signature" w:semiHidden="1" w:unhideWhenUsed="1"/>
-    <w:lsdException w:name="Default Paragraph Font" w:semiHidden="1" w:uiPriority="1" w:unhideWhenUsed="1"/>
-    <w:lsdException w:name="Body Text" w:semiHidden="1" w:unhideWhenUsed="1"/>
-    <w:lsdException w:name="Body Text Indent" w:semiHidden="1" w:unhideWhenUsed="1"/>
-    <w:lsdException w:name="List Continue" w:semiHidden="1" w:unhideWhenUsed="1"/>
-    <w:lsdException w:name="List Continue 2" w:semiHidden="1" w:unhideWhenUsed="1"/>
-    <w:lsdException w:name="List Continue 3" w:semiHidden="1" w:unhideWhenUsed="1"/>
-    <w:lsdException w:name="List Continue 4" w:semiHidden="1" w:unhideWhenUsed="1"/>
-    <w:lsdException w:name="List Continue 5" w:semiHidden="1" w:unhideWhenUsed="1"/>
-    <w:lsdException w:name="Message Header" w:semiHidden="1" w:unhideWhenUsed="1"/>
-    <w:lsdException w:name="Subtitle" w:uiPriority="11" w:qFormat="1"/>
-    <w:lsdException w:name="Salutation" w:semiHidden="1" w:unhideWhenUsed="1"/>
-    <w:lsdException w:name="Date" w:semiHidden="1" w:unhideWhenUsed="1"/>
-    <w:lsdException w:name="Body Text First Indent" w:semiHidden="1" w:unhideWhenUsed="1"/>
-    <w:lsdException w:name="Body Text First Indent 2" w:semiHidden="1" w:unhideWhenUsed="1"/>
-    <w:lsdException w:name="Note Heading" w:semiHidden="1" w:unhideWhenUsed="1"/>
-    <w:lsdException w:name="Body Text 2" w:semiHidden="1" w:unhideWhenUsed="1"/>
-    <w:lsdException w:name="Body Text 3" w:semiHidden="1" w:unhideWhenUsed="1"/>
-    <w:lsdException w:name="Body Text Indent 2" w:semiHidden="1" w:unhideWhenUsed="1"/>
-    <w:lsdException w:name="Body Text Indent 3" w:semiHidden="1" w:unhideWhenUsed="1"/>
-    <w:lsdException w:name="Block Text" w:semiHidden="1" w:unhideWhenUsed="1"/>
-    <w:lsdException w:name="Hyperlink" w:semiHidden="1" w:unhideWhenUsed="1"/>
-    <w:lsdException w:name="FollowedHyperlink" w:semiHidden="1" w:unhideWhenUsed="1"/>
-    <w:lsdException w:name="Strong" w:uiPriority="22" w:qFormat="1"/>
-    <w:lsdException w:name="Emphasis" w:uiPriority="20" w:qFormat="1"/>
-    <w:lsdException w:name="Document Map" w:semiHidden="1" w:unhideWhenUsed="1"/>
-    <w:lsdException w:name="Plain Text" w:semiHidden="1" w:unhideWhenUsed="1"/>
-    <w:lsdException w:name="E-mail Signature" w:semiHidden="1" w:unhideWhenUsed="1"/>
-    <w:lsdException w:name="HTML Top of Form" w:semiHidden="1" w:unhideWhenUsed="1"/>
-    <w:lsdException w:name="HTML Bottom of Form" w:semiHidden="1" w:unhideWhenUsed="1"/>
-    <w:lsdException w:name="Normal (Web)" w:semiHidden="1" w:unhideWhenUsed="1"/>
-    <w:lsdException w:name="HTML Acronym" w:semiHidden="1" w:unhideWhenUsed="1"/>
-    <w:lsdException w:name="HTML Address" w:semiHidden="1" w:unhideWhenUsed="1"/>
-    <w:lsdException w:name="HTML Cite" w:semiHidden="1" w:unhideWhenUsed="1"/>
-    <w:lsdException w:name="HTML Code" w:semiHidden="1" w:unhideWhenUsed="1"/>
-    <w:lsdException w:name="HTML Definition" w:semiHidden="1" w:unhideWhenUsed="1"/>
-    <w:lsdException w:name="HTML Keyboard" w:semiHidden="1" w:unhideWhenUsed="1"/>
-    <w:lsdException w:name="HTML Preformatted" w:semiHidden="1" w:unhideWhenUsed="1"/>
-    <w:lsdException w:name="HTML Sample" w:semiHidden="1" w:unhideWhenUsed="1"/>
-    <w:lsdException w:name="HTML Typewriter" w:semiHidden="1" w:unhideWhenUsed="1"/>
-    <w:lsdException w:name="HTML Variable" w:semiHidden="1" w:unhideWhenUsed="1"/>
-    <w:lsdException w:name="Normal Table" w:semiHidden="1" w:unhideWhenUsed="1"/>
-    <w:lsdException w:name="annotation subject" w:semiHidden="1" w:unhideWhenUsed="1"/>
-    <w:lsdException w:name="No List" w:semiHidden="1" w:unhideWhenUsed="1"/>
-    <w:lsdException w:name="Outline List 1" w:semiHidden="1" w:unhideWhenUsed="1"/>
-    <w:lsdException w:name="Outline List 2" w:semiHidden="1" w:unhideWhenUsed="1"/>
-    <w:lsdException w:name="Outline List 3" w:semiHidden="1" w:unhideWhenUsed="1"/>
-    <w:lsdException w:name="Table Simple 1" w:semiHidden="1" w:unhideWhenUsed="1"/>
-    <w:lsdException w:name="Table Simple 2" w:semiHidden="1" w:unhideWhenUsed="1"/>
-    <w:lsdException w:name="Table Simple 3" w:semiHidden="1" w:unhideWhenUsed="1"/>
-    <w:lsdException w:name="Table Classic 1" w:semiHidden="1" w:unhideWhenUsed="1"/>
-    <w:lsdException w:name="Table Classic 2" w:semiHidden="1" w:unhideWhenUsed="1"/>
-    <w:lsdException w:name="Table Classic 3" w:semiHidden="1" w:unhideWhenUsed="1"/>
-    <w:lsdException w:name="Table Classic 4" w:semiHidden="1" w:unhideWhenUsed="1"/>
-    <w:lsdException w:name="Table Colorful 1" w:semiHidden="1" w:unhideWhenUsed="1"/>
-    <w:lsdException w:name="Table Colorful 2" w:semiHidden="1" w:unhideWhenUsed="1"/>
-    <w:lsdException w:name="Table Colorful 3" w:semiHidden="1" w:unhideWhenUsed="1"/>
-    <w:lsdException w:name="Table Columns 1" w:semiHidden="1" w:unhideWhenUsed="1"/>
-    <w:lsdException w:name="Table Columns 2" w:semiHidden="1" w:unhideWhenUsed="1"/>
-    <w:lsdException w:name="Table Columns 3" w:semiHidden="1" w:unhideWhenUsed="1"/>
-    <w:lsdException w:name="Table Columns 4" w:semiHidden="1" w:unhideWhenUsed="1"/>
-    <w:lsdException w:name="Table Columns 5" w:semiHidden="1" w:unhideWhenUsed="1"/>
-    <w:lsdException w:name="Table Grid 1" w:semiHidden="1" w:unhideWhenUsed="1"/>
-    <w:lsdException w:name="Table Grid 2" w:semiHidden="1" w:unhideWhenUsed="1"/>
-    <w:lsdException w:name="Table Grid 3" w:semiHidden="1" w:unhideWhenUsed="1"/>
-    <w:lsdException w:name="Table Grid 4" w:semiHidden="1" w:unhideWhenUsed="1"/>
-    <w:lsdException w:name="Table Grid 5" w:semiHidden="1" w:unhideWhenUsed="1"/>
-    <w:lsdException w:name="Table Grid 6" w:semiHidden="1" w:unhideWhenUsed="1"/>
-    <w:lsdException w:name="Table Grid 7" w:semiHidden="1" w:unhideWhenUsed="1"/>
-    <w:lsdException w:name="Table Grid 8" w:semiHidden="1" w:unhideWhenUsed="1"/>
-    <w:lsdException w:name="Table List 1" w:semiHidden="1" w:unhideWhenUsed="1"/>
-    <w:lsdException w:name="Table List 2" w:semiHidden="1" w:unhideWhenUsed="1"/>
-    <w:lsdException w:name="Table List 3" w:semiHidden="1" w:unhideWhenUsed="1"/>
-    <w:lsdException w:name="Table List 4" w:semiHidden="1" w:unhideWhenUsed="1"/>
-    <w:lsdException w:name="Table List 5" w:semiHidden="1" w:unhideWhenUsed="1"/>
-    <w:lsdException w:name="Table List 6" w:semiHidden="1" w:unhideWhenUsed="1"/>
-    <w:lsdException w:name="Table List 7" w:semiHidden="1" w:unhideWhenUsed="1"/>
-    <w:lsdException w:name="Table List 8" w:semiHidden="1" w:unhideWhenUsed="1"/>
-    <w:lsdException w:name="Table 3D effects 1" w:semiHidden="1" w:unhideWhenUsed="1"/>
-    <w:lsdException w:name="Table 3D effects 2" w:semiHidden="1" w:unhideWhenUsed="1"/>
-    <w:lsdException w:name="Table 3D effects 3" w:semiHidden="1" w:unhideWhenUsed="1"/>
-    <w:lsdException w:name="Table Contemporary" w:semiHidden="1" w:unhideWhenUsed="1"/>
-    <w:lsdException w:name="Table Elegant" w:semiHidden="1" w:unhideWhenUsed="1"/>
-    <w:lsdException w:name="Table Professional" w:semiHidden="1" w:unhideWhenUsed="1"/>
-    <w:lsdException w:name="Table Subtle 1" w:semiHidden="1" w:unhideWhenUsed="1"/>
-    <w:lsdException w:name="Table Subtle 2" w:semiHidden="1" w:unhideWhenUsed="1"/>
-    <w:lsdException w:name="Table Web 1" w:semiHidden="1" w:unhideWhenUsed="1"/>
-    <w:lsdException w:name="Table Web 2" w:semiHidden="1" w:unhideWhenUsed="1"/>
-    <w:lsdException w:name="Table Web 3" w:semiHidden="1" w:unhideWhenUsed="1"/>
-    <w:lsdException w:name="Balloon Text" w:semiHidden="1" w:unhideWhenUsed="1"/>
-    <w:lsdException w:name="Table Grid" w:uiPriority="39"/>
-    <w:lsdException w:name="Table Theme" w:semiHidden="1" w:unhideWhenUsed="1"/>
-    <w:lsdException w:name="Placeholder Text" w:semiHidden="1"/>
-    <w:lsdException w:name="No Spacing" w:uiPriority="1" w:qFormat="1"/>
-    <w:lsdException w:name="Light Shading" w:uiPriority="60"/>
-    <w:lsdException w:name="Light List" w:uiPriority="61"/>
-    <w:lsdException w:name="Light Grid" w:uiPriority="62"/>
-    <w:lsdException w:name="Medium Shading 1" w:uiPriority="63"/>
-    <w:lsdException w:name="Medium Shading 2" w:uiPriority="64"/>
-    <w:lsdException w:name="Medium List 1" w:uiPriority="65"/>
-    <w:lsdException w:name="Medium List 2" w:uiPriority="66"/>
-    <w:lsdException w:name="Medium Grid 1" w:uiPriority="67"/>
-    <w:lsdException w:name="Medium Grid 2" w:uiPriority="68"/>
-    <w:lsdException w:name="Medium Grid 3" w:uiPriority="69"/>
-    <w:lsdException w:name="Dark List" w:uiPriority="70"/>
-    <w:lsdException w:name="Colorful Shading" w:uiPriority="71"/>
-    <w:lsdException w:name="Colorful List" w:uiPriority="72"/>
-    <w:lsdException w:name="Colorful Grid" w:uiPriority="73"/>
-    <w:lsdException w:name="Light Shading Accent 1" w:uiPriority="60"/>
-    <w:lsdException w:name="Light List Accent 1" w:uiPriority="61"/>
-    <w:lsdException w:name="Light Grid Accent 1" w:uiPriority="62"/>
-    <w:lsdException w:name="Medium Shading 1 Accent 1" w:uiPriority="63"/>
-    <w:lsdException w:name="Medium Shading 2 Accent 1" w:uiPriority="64"/>
-    <w:lsdException w:name="Medium List 1 Accent 1" w:uiPriority="65"/>
-    <w:lsdException w:name="Revision" w:semiHidden="1"/>
-    <w:lsdException w:name="List Paragraph" w:uiPriority="34" w:qFormat="1"/>
-    <w:lsdException w:name="Quote" w:uiPriority="29" w:qFormat="1"/>
-    <w:lsdException w:name="Intense Quote" w:uiPriority="30" w:qFormat="1"/>
-    <w:lsdException w:name="Medium List 2 Accent 1" w:uiPriority="66"/>
-    <w:lsdException w:name="Medium Grid 1 Accent 1" w:uiPriority="67"/>
-    <w:lsdException w:name="Medium Grid 2 Accent 1" w:uiPriority="68"/>
-    <w:lsdException w:name="Medium Grid 3 Accent 1" w:uiPriority="69"/>
-    <w:lsdException w:name="Dark List Accent 1" w:uiPriority="70"/>
-    <w:lsdException w:name="Colorful Shading Accent 1" w:uiPriority="71"/>
-    <w:lsdException w:name="Colorful List Accent 1" w:uiPriority="72"/>
-    <w:lsdException w:name="Colorful Grid Accent 1" w:uiPriority="73"/>
-    <w:lsdException w:name="Light Shading Accent 2" w:uiPriority="60"/>
-    <w:lsdException w:name="Light List Accent 2" w:uiPriority="61"/>
-    <w:lsdException w:name="Light Grid Accent 2" w:uiPriority="62"/>
-    <w:lsdException w:name="Medium Shading 1 Accent 2" w:uiPriority="63"/>
-    <w:lsdException w:name="Medium Shading 2 Accent 2" w:uiPriority="64"/>
-    <w:lsdException w:name="Medium List 1 Accent 2" w:uiPriority="65"/>
-    <w:lsdException w:name="Medium List 2 Accent 2" w:uiPriority="66"/>
-    <w:lsdException w:name="Medium Grid 1 Accent 2" w:uiPriority="67"/>
-    <w:lsdException w:name="Medium Grid 2 Accent 2" w:uiPriority="68"/>
-    <w:lsdException w:name="Medium Grid 3 Accent 2" w:uiPriority="69"/>
-    <w:lsdException w:name="Dark List Accent 2" w:uiPriority="70"/>
-    <w:lsdException w:name="Colorful Shading Accent 2" w:uiPriority="71"/>
-    <w:lsdException w:name="Colorful List Accent 2" w:uiPriority="72"/>
-    <w:lsdException w:name="Colorful Grid Accent 2" w:uiPriority="73"/>
-    <w:lsdException w:name="Light Shading Accent 3" w:uiPriority="60"/>
-    <w:lsdException w:name="Light List Accent 3" w:uiPriority="61"/>
-    <w:lsdException w:name="Light Grid Accent 3" w:uiPriority="62"/>
-    <w:lsdException w:name="Medium Shading 1 Accent 3" w:uiPriority="63"/>
-    <w:lsdException w:name="Medium Shading 2 Accent 3" w:uiPriority="64"/>
-    <w:lsdException w:name="Medium List 1 Accent 3" w:uiPriority="65"/>
-    <w:lsdException w:name="Medium List 2 Accent 3" w:uiPriority="66"/>
-    <w:lsdException w:name="Medium Grid 1 Accent 3" w:uiPriority="67"/>
-    <w:lsdException w:name="Medium Grid 2 Accent 3" w:uiPriority="68"/>
-    <w:lsdException w:name="Medium Grid 3 Accent 3" w:uiPriority="69"/>
-    <w:lsdException w:name="Dark List Accent 3" w:uiPriority="70"/>
-    <w:lsdException w:name="Colorful Shading Accent 3" w:uiPriority="71"/>
-    <w:lsdException w:name="Colorful List Accent 3" w:uiPriority="72"/>
-    <w:lsdException w:name="Colorful Grid Accent 3" w:uiPriority="73"/>
-    <w:lsdException w:name="Light Shading Accent 4" w:uiPriority="60"/>
-    <w:lsdException w:name="Light List Accent 4" w:uiPriority="61"/>
-    <w:lsdException w:name="Light Grid Accent 4" w:uiPriority="62"/>
-    <w:lsdException w:name="Medium Shading 1 Accent 4" w:uiPriority="63"/>
-    <w:lsdException w:name="Medium Shading 2 Accent 4" w:uiPriority="64"/>
-    <w:lsdException w:name="Medium List 1 Accent 4" w:uiPriority="65"/>
-    <w:lsdException w:name="Medium List 2 Accent 4" w:uiPriority="66"/>
-    <w:lsdException w:name="Medium Grid 1 Accent 4" w:uiPriority="67"/>
-    <w:lsdException w:name="Medium Grid 2 Accent 4" w:uiPriority="68"/>
-    <w:lsdException w:name="Medium Grid 3 Accent 4" w:uiPriority="69"/>
-    <w:lsdException w:name="Dark List Accent 4" w:uiPriority="70"/>
-    <w:lsdException w:name="Colorful Shading Accent 4" w:uiPriority="71"/>
-    <w:lsdException w:name="Colorful List Accent 4" w:uiPriority="72"/>
-    <w:lsdException w:name="Colorful Grid Accent 4" w:uiPriority="73"/>
-    <w:lsdException w:name="Light Shading Accent 5" w:uiPriority="60"/>
-    <w:lsdException w:name="Light List Accent 5" w:uiPriority="61"/>
-    <w:lsdException w:name="Light Grid Accent 5" w:uiPriority="62"/>
-    <w:lsdException w:name="Medium Shading 1 Accent 5" w:uiPriority="63"/>
-    <w:lsdException w:name="Medium Shading 2 Accent 5" w:uiPriority="64"/>
-    <w:lsdException w:name="Medium List 1 Accent 5" w:uiPriority="65"/>
-    <w:lsdException w:name="Medium List 2 Accent 5" w:uiPriority="66"/>
-    <w:lsdException w:name="Medium Grid 1 Accent 5" w:uiPriority="67"/>
-    <w:lsdException w:name="Medium Grid 2 Accent 5" w:uiPriority="68"/>
-    <w:lsdException w:name="Medium Grid 3 Accent 5" w:uiPriority="69"/>
-    <w:lsdException w:name="Dark List Accent 5" w:uiPriority="70"/>
-    <w:lsdException w:name="Colorful Shading Accent 5" w:uiPriority="71"/>
-    <w:lsdException w:name="Colorful List Accent 5" w:uiPriority="72"/>
-    <w:lsdException w:name="Colorful Grid Accent 5" w:uiPriority="73"/>
-    <w:lsdException w:name="Light Shading Accent 6" w:uiPriority="60"/>
-    <w:lsdException w:name="Light List Accent 6" w:uiPriority="61"/>
-    <w:lsdException w:name="Light Grid Accent 6" w:uiPriority="62"/>
-    <w:lsdException w:name="Medium Shading 1 Accent 6" w:uiPriority="63"/>
-    <w:lsdException w:name="Medium Shading 2 Accent 6" w:uiPriority="64"/>
-    <w:lsdException w:name="Medium List 1 Accent 6" w:uiPriority="65"/>
-    <w:lsdException w:name="Medium List 2 Accent 6" w:uiPriority="66"/>
-    <w:lsdException w:name="Medium Grid 1 Accent 6" w:uiPriority="67"/>
-    <w:lsdException w:name="Medium Grid 2 Accent 6" w:uiPriority="68"/>
-    <w:lsdException w:name="Medium Grid 3 Accent 6" w:uiPriority="69"/>
-    <w:lsdException w:name="Dark List Accent 6" w:uiPriority="70"/>
-    <w:lsdException w:name="Colorful Shading Accent 6" w:uiPriority="71"/>
-    <w:lsdException w:name="Colorful List Accent 6" w:uiPriority="72"/>
-    <w:lsdException w:name="Colorful Grid Accent 6" w:uiPriority="73"/>
-    <w:lsdException w:name="Subtle Emphasis" w:uiPriority="19" w:qFormat="1"/>
-    <w:lsdException w:name="Intense Emphasis" w:uiPriority="21" w:qFormat="1"/>
-    <w:lsdException w:name="Subtle Reference" w:uiPriority="31" w:qFormat="1"/>
-    <w:lsdException w:name="Intense Reference" w:uiPriority="32" w:qFormat="1"/>
-    <w:lsdException w:name="Book Title" w:uiPriority="33" w:qFormat="1"/>
-    <w:lsdException w:name="Bibliography" w:semiHidden="1" w:uiPriority="37" w:unhideWhenUsed="1"/>
-    <w:lsdException w:name="TOC Heading" w:semiHidden="1" w:uiPriority="39" w:unhideWhenUsed="1" w:qFormat="1"/>
-    <w:lsdException w:name="Plain Table 1" w:uiPriority="41"/>
-    <w:lsdException w:name="Plain Table 2" w:uiPriority="42"/>
-    <w:lsdException w:name="Plain Table 3" w:uiPriority="43"/>
-    <w:lsdException w:name="Plain Table 4" w:uiPriority="44"/>
-    <w:lsdException w:name="Plain Table 5" w:uiPriority="45"/>
-    <w:lsdException w:name="Grid Table Light" w:uiPriority="40"/>
-    <w:lsdException w:name="Grid Table 1 Light" w:uiPriority="46"/>
-    <w:lsdException w:name="Grid Table 2" w:uiPriority="47"/>
-    <w:lsdException w:name="Grid Table 3" w:uiPriority="48"/>
-    <w:lsdException w:name="Grid Table 4" w:uiPriority="49"/>
-    <w:lsdException w:name="Grid Table 5 Dark" w:uiPriority="50"/>
-    <w:lsdException w:name="Grid Table 6 Colorful" w:uiPriority="51"/>
-    <w:lsdException w:name="Grid Table 7 Colorful" w:uiPriority="52"/>
-    <w:lsdException w:name="Grid Table 1 Light Accent 1" w:uiPriority="46"/>
-    <w:lsdException w:name="Grid Table 2 Accent 1" w:uiPriority="47"/>
-    <w:lsdException w:name="Grid Table 3 Accent 1" w:uiPriority="48"/>
-    <w:lsdException w:name="Grid Table 4 Accent 1" w:uiPriority="49"/>
-    <w:lsdException w:name="Grid Table 5 Dark Accent 1" w:uiPriority="50"/>
-    <w:lsdException w:name="Grid Table 6 Colorful Accent 1" w:uiPriority="51"/>
-    <w:lsdException w:name="Grid Table 7 Colorful Accent 1" w:uiPriority="52"/>
-    <w:lsdException w:name="Grid Table 1 Light Accent 2" w:uiPriority="46"/>
-    <w:lsdException w:name="Grid Table 2 Accent 2" w:uiPriority="47"/>
-    <w:lsdException w:name="Grid Table 3 Accent 2" w:uiPriority="48"/>
-    <w:lsdException w:name="Grid Table 4 Accent 2" w:uiPriority="49"/>
-    <w:lsdException w:name="Grid Table 5 Dark Accent 2" w:uiPriority="50"/>
-    <w:lsdException w:name="Grid Table 6 Colorful Accent 2" w:uiPriority="51"/>
-    <w:lsdException w:name="Grid Table 7 Colorful Accent 2" w:uiPriority="52"/>
-    <w:lsdException w:name="Grid Table 1 Light Accent 3" w:uiPriority="46"/>
-    <w:lsdException w:name="Grid Table 2 Accent 3" w:uiPriority="47"/>
-    <w:lsdException w:name="Grid Table 3 Accent 3" w:uiPriority="48"/>
-    <w:lsdException w:name="Grid Table 4 Accent 3" w:uiPriority="49"/>
-    <w:lsdException w:name="Grid Table 5 Dark Accent 3" w:uiPriority="50"/>
-    <w:lsdException w:name="Grid Table 6 Colorful Accent 3" w:uiPriority="51"/>
-    <w:lsdException w:name="Grid Table 7 Colorful Accent 3" w:uiPriority="52"/>
-    <w:lsdException w:name="Grid Table 1 Light Accent 4" w:uiPriority="46"/>
-    <w:lsdException w:name="Grid Table 2 Accent 4" w:uiPriority="47"/>
-    <w:lsdException w:name="Grid Table 3 Accent 4" w:uiPriority="48"/>
-    <w:lsdException w:name="Grid Table 4 Accent 4" w:uiPriority="49"/>
-    <w:lsdException w:name="Grid Table 5 Dark Accent 4" w:uiPriority="50"/>
-    <w:lsdException w:name="Grid Table 6 Colorful Accent 4" w:uiPriority="51"/>
-    <w:lsdException w:name="Grid Table 7 Colorful Accent 4" w:uiPriority="52"/>
-    <w:lsdException w:name="Grid Table 1 Light Accent 5" w:uiPriority="46"/>
-    <w:lsdException w:name="Grid Table 2 Accent 5" w:uiPriority="47"/>
-    <w:lsdException w:name="Grid Table 3 Accent 5" w:uiPriority="48"/>
-    <w:lsdException w:name="Grid Table 4 Accent 5" w:uiPriority="49"/>
-    <w:lsdException w:name="Grid Table 5 Dark Accent 5" w:uiPriority="50"/>
-    <w:lsdException w:name="Grid Table 6 Colorful Accent 5" w:uiPriority="51"/>
-    <w:lsdException w:name="Grid Table 7 Colorful Accent 5" w:uiPriority="52"/>
-    <w:lsdException w:name="Grid Table 1 Light Accent 6" w:uiPriority="46"/>
-    <w:lsdException w:name="Grid Table 2 Accent 6" w:uiPriority="47"/>
-    <w:lsdException w:name="Grid Table 3 Accent 6" w:uiPriority="48"/>
-    <w:lsdException w:name="Grid Table 4 Accent 6" w:uiPriority="49"/>
-    <w:lsdException w:name="Grid Table 5 Dark Accent 6" w:uiPriority="50"/>
-    <w:lsdException w:name="Grid Table 6 Colorful Accent 6" w:uiPriority="51"/>
-    <w:lsdException w:name="Grid Table 7 Colorful Accent 6" w:uiPriority="52"/>
-    <w:lsdException w:name="List Table 1 Light" w:uiPriority="46"/>
-    <w:lsdException w:name="List Table 2" w:uiPriority="47"/>
-    <w:lsdException w:name="List Table 3" w:uiPriority="48"/>
-    <w:lsdException w:name="List Table 4" w:uiPriority="49"/>
-    <w:lsdException w:name="List Table 5 Dark" w:uiPriority="50"/>
-    <w:lsdException w:name="List Table 6 Colorful" w:uiPriority="51"/>
-    <w:lsdException w:name="List Table 7 Colorful" w:uiPriority="52"/>
-    <w:lsdException w:name="List Table 1 Light Accent 1" w:uiPriority="46"/>
-    <w:lsdException w:name="List Table 2 Accent 1" w:uiPriority="47"/>
-    <w:lsdException w:name="List Table 3 Accent 1" w:uiPriority="48"/>
-    <w:lsdException w:name="List Table 4 Accent 1" w:uiPriority="49"/>
-    <w:lsdException w:name="List Table 5 Dark Accent 1" w:uiPriority="50"/>
-    <w:lsdException w:name="List Table 6 Colorful Accent 1" w:uiPriority="51"/>
-    <w:lsdException w:name="List Table 7 Colorful Accent 1" w:uiPriority="52"/>
-    <w:lsdException w:name="List Table 1 Light Accent 2" w:uiPriority="46"/>
-    <w:lsdException w:name="List Table 2 Accent 2" w:uiPriority="47"/>
-    <w:lsdException w:name="List Table 3 Accent 2" w:uiPriority="48"/>
-    <w:lsdException w:name="List Table 4 Accent 2" w:uiPriority="49"/>
-    <w:lsdException w:name="List Table 5 Dark Accent 2" w:uiPriority="50"/>
-    <w:lsdException w:name="List Table 6 Colorful Accent 2" w:uiPriority="51"/>
-    <w:lsdException w:name="List Table 7 Colorful Accent 2" w:uiPriority="52"/>
-    <w:lsdException w:name="List Table 1 Light Accent 3" w:uiPriority="46"/>
-    <w:lsdException w:name="List Table 2 Accent 3" w:uiPriority="47"/>
-    <w:lsdException w:name="List Table 3 Accent 3" w:uiPriority="48"/>
-    <w:lsdException w:name="List Table 4 Accent 3" w:uiPriority="49"/>
-    <w:lsdException w:name="List Table 5 Dark Accent 3" w:uiPriority="50"/>
-    <w:lsdException w:name="List Table 6 Colorful Accent 3" w:uiPriority="51"/>
-    <w:lsdException w:name="List Table 7 Colorful Accent 3" w:uiPriority="52"/>
-    <w:lsdException w:name="List Table 1 Light Accent 4" w:uiPriority="46"/>
-    <w:lsdException w:name="List Table 2 Accent 4" w:uiPriority="47"/>
-    <w:lsdException w:name="List Table 3 Accent 4" w:uiPriority="48"/>
-    <w:lsdException w:name="List Table 4 Accent 4" w:uiPriority="49"/>
-    <w:lsdException w:name="List Table 5 Dark Accent 4" w:uiPriority="50"/>
-    <w:lsdException w:name="List Table 6 Colorful Accent 4" w:uiPriority="51"/>
-    <w:lsdException w:name="List Table 7 Colorful Accent 4" w:uiPriority="52"/>
-    <w:lsdException w:name="List Table 1 Light Accent 5" w:uiPriority="46"/>
-    <w:lsdException w:name="List Table 2 Accent 5" w:uiPriority="47"/>
-    <w:lsdException w:name="List Table 3 Accent 5" w:uiPriority="48"/>
-    <w:lsdException w:name="List Table 4 Accent 5" w:uiPriority="49"/>
-    <w:lsdException w:name="List Table 5 Dark Accent 5" w:uiPriority="50"/>
-    <w:lsdException w:name="List Table 6 Colorful Accent 5" w:uiPriority="51"/>
-    <w:lsdException w:name="List Table 7 Colorful Accent 5" w:uiPriority="52"/>
-    <w:lsdException w:name="List Table 1 Light Accent 6" w:uiPriority="46"/>
-    <w:lsdException w:name="List Table 2 Accent 6" w:uiPriority="47"/>
-    <w:lsdException w:name="List Table 3 Accent 6" w:uiPriority="48"/>
-    <w:lsdException w:name="List Table 4 Accent 6" w:uiPriority="49"/>
-    <w:lsdException w:name="List Table 5 Dark Accent 6" w:uiPriority="50"/>
-    <w:lsdException w:name="List Table 6 Colorful Accent 6" w:uiPriority="51"/>
-    <w:lsdException w:name="List Table 7 Colorful Accent 6" w:uiPriority="52"/>
+  <w:latentStyles w:defLockedState="0" w:defUIPriority="99" w:defSemiHidden="1" w:defUnhideWhenUsed="1" w:defQFormat="0" w:count="267">
+    <w:lsdException w:name="Normal" w:semiHidden="0" w:uiPriority="0" w:unhideWhenUsed="0" w:qFormat="1"/>
+    <w:lsdException w:name="heading 1" w:semiHidden="0" w:uiPriority="9" w:unhideWhenUsed="0" w:qFormat="1"/>
+    <w:lsdException w:name="heading 2" w:uiPriority="9" w:qFormat="1"/>
+    <w:lsdException w:name="heading 3" w:uiPriority="9" w:qFormat="1"/>
+    <w:lsdException w:name="heading 4" w:uiPriority="9" w:qFormat="1"/>
+    <w:lsdException w:name="heading 5" w:uiPriority="9" w:qFormat="1"/>
+    <w:lsdException w:name="heading 6" w:uiPriority="9" w:qFormat="1"/>
+    <w:lsdException w:name="heading 7" w:uiPriority="9" w:qFormat="1"/>
+    <w:lsdException w:name="heading 8" w:uiPriority="9" w:qFormat="1"/>
+    <w:lsdException w:name="heading 9" w:uiPriority="9" w:qFormat="1"/>
+    <w:lsdException w:name="toc 1" w:uiPriority="39"/>
+    <w:lsdException w:name="toc 2" w:uiPriority="39"/>
+    <w:lsdException w:name="toc 3" w:uiPriority="39"/>
+    <w:lsdException w:name="toc 4" w:uiPriority="39"/>
+    <w:lsdException w:name="toc 5" w:uiPriority="39"/>
+    <w:lsdException w:name="toc 6" w:uiPriority="39"/>
+    <w:lsdException w:name="toc 7" w:uiPriority="39"/>
+    <w:lsdException w:name="toc 8" w:uiPriority="39"/>
+    <w:lsdException w:name="toc 9" w:uiPriority="39"/>
+    <w:lsdException w:name="caption" w:uiPriority="35" w:qFormat="1"/>
+    <w:lsdException w:name="Title" w:semiHidden="0" w:uiPriority="10" w:unhideWhenUsed="0" w:qFormat="1"/>
+    <w:lsdException w:name="Default Paragraph Font" w:uiPriority="1"/>
+    <w:lsdException w:name="Subtitle" w:semiHidden="0" w:uiPriority="11" w:unhideWhenUsed="0" w:qFormat="1"/>
+    <w:lsdException w:name="Strong" w:semiHidden="0" w:uiPriority="22" w:unhideWhenUsed="0" w:qFormat="1"/>
+    <w:lsdException w:name="Emphasis" w:semiHidden="0" w:uiPriority="20" w:unhideWhenUsed="0" w:qFormat="1"/>
+    <w:lsdException w:name="Table Grid" w:semiHidden="0" w:uiPriority="39" w:unhideWhenUsed="0"/>
+    <w:lsdException w:name="Placeholder Text" w:unhideWhenUsed="0"/>
+    <w:lsdException w:name="No Spacing" w:semiHidden="0" w:uiPriority="1" w:unhideWhenUsed="0" w:qFormat="1"/>
+    <w:lsdException w:name="Light Shading" w:semiHidden="0" w:uiPriority="60" w:unhideWhenUsed="0"/>
+    <w:lsdException w:name="Light List" w:semiHidden="0" w:uiPriority="61" w:unhideWhenUsed="0"/>
+    <w:lsdException w:name="Light Grid" w:semiHidden="0" w:uiPriority="62" w:unhideWhenUsed="0"/>
+    <w:lsdException w:name="Medium Shading 1" w:semiHidden="0" w:uiPriority="63" w:unhideWhenUsed="0"/>
+    <w:lsdException w:name="Medium Shading 2" w:semiHidden="0" w:uiPriority="64" w:unhideWhenUsed="0"/>
+    <w:lsdException w:name="Medium List 1" w:semiHidden="0" w:uiPriority="65" w:unhideWhenUsed="0"/>
+    <w:lsdException w:name="Medium List 2" w:semiHidden="0" w:uiPriority="66" w:unhideWhenUsed="0"/>
+    <w:lsdException w:name="Medium Grid 1" w:semiHidden="0" w:uiPriority="67" w:unhideWhenUsed="0"/>
+    <w:lsdException w:name="Medium Grid 2" w:semiHidden="0" w:uiPriority="68" w:unhideWhenUsed="0"/>
+    <w:lsdException w:name="Medium Grid 3" w:semiHidden="0" w:uiPriority="69" w:unhideWhenUsed="0"/>
+    <w:lsdException w:name="Dark List" w:semiHidden="0" w:uiPriority="70" w:unhideWhenUsed="0"/>
+    <w:lsdException w:name="Colorful Shading" w:semiHidden="0" w:uiPriority="71" w:unhideWhenUsed="0"/>
+    <w:lsdException w:name="Colorful List" w:semiHidden="0" w:uiPriority="72" w:unhideWhenUsed="0"/>
+    <w:lsdException w:name="Colorful Grid" w:semiHidden="0" w:uiPriority="73" w:unhideWhenUsed="0"/>
+    <w:lsdException w:name="Light Shading Accent 1" w:semiHidden="0" w:uiPriority="60" w:unhideWhenUsed="0"/>
+    <w:lsdException w:name="Light List Accent 1" w:semiHidden="0" w:uiPriority="61" w:unhideWhenUsed="0"/>
+    <w:lsdException w:name="Light Grid Accent 1" w:semiHidden="0" w:uiPriority="62" w:unhideWhenUsed="0"/>
+    <w:lsdException w:name="Medium Shading 1 Accent 1" w:semiHidden="0" w:uiPriority="63" w:unhideWhenUsed="0"/>
+    <w:lsdException w:name="Medium Shading 2 Accent 1" w:semiHidden="0" w:uiPriority="64" w:unhideWhenUsed="0"/>
+    <w:lsdException w:name="Medium List 1 Accent 1" w:semiHidden="0" w:uiPriority="65" w:unhideWhenUsed="0"/>
+    <w:lsdException w:name="Revision" w:unhideWhenUsed="0"/>
+    <w:lsdException w:name="List Paragraph" w:semiHidden="0" w:uiPriority="34" w:unhideWhenUsed="0" w:qFormat="1"/>
+    <w:lsdException w:name="Quote" w:semiHidden="0" w:uiPriority="29" w:unhideWhenUsed="0" w:qFormat="1"/>
+    <w:lsdException w:name="Intense Quote" w:semiHidden="0" w:uiPriority="30" w:unhideWhenUsed="0" w:qFormat="1"/>
+    <w:lsdException w:name="Medium List 2 Accent 1" w:semiHidden="0" w:uiPriority="66" w:unhideWhenUsed="0"/>
+    <w:lsdException w:name="Medium Grid 1 Accent 1" w:semiHidden="0" w:uiPriority="67" w:unhideWhenUsed="0"/>
+    <w:lsdException w:name="Medium Grid 2 Accent 1" w:semiHidden="0" w:uiPriority="68" w:unhideWhenUsed="0"/>
+    <w:lsdException w:name="Medium Grid 3 Accent 1" w:semiHidden="0" w:uiPriority="69" w:unhideWhenUsed="0"/>
+    <w:lsdException w:name="Dark List Accent 1" w:semiHidden="0" w:uiPriority="70" w:unhideWhenUsed="0"/>
+    <w:lsdException w:name="Colorful Shading Accent 1" w:semiHidden="0" w:uiPriority="71" w:unhideWhenUsed="0"/>
+    <w:lsdException w:name="Colorful List Accent 1" w:semiHidden="0" w:uiPriority="72" w:unhideWhenUsed="0"/>
+    <w:lsdException w:name="Colorful Grid Accent 1" w:semiHidden="0" w:uiPriority="73" w:unhideWhenUsed="0"/>
+    <w:lsdException w:name="Light Shading Accent 2" w:semiHidden="0" w:uiPriority="60" w:unhideWhenUsed="0"/>
+    <w:lsdException w:name="Light List Accent 2" w:semiHidden="0" w:uiPriority="61" w:unhideWhenUsed="0"/>
+    <w:lsdException w:name="Light Grid Accent 2" w:semiHidden="0" w:uiPriority="62" w:unhideWhenUsed="0"/>
+    <w:lsdException w:name="Medium Shading 1 Accent 2" w:semiHidden="0" w:uiPriority="63" w:unhideWhenUsed="0"/>
+    <w:lsdException w:name="Medium Shading 2 Accent 2" w:semiHidden="0" w:uiPriority="64" w:unhideWhenUsed="0"/>
+    <w:lsdException w:name="Medium List 1 Accent 2" w:semiHidden="0" w:uiPriority="65" w:unhideWhenUsed="0"/>
+    <w:lsdException w:name="Medium List 2 Accent 2" w:semiHidden="0" w:uiPriority="66" w:unhideWhenUsed="0"/>
+    <w:lsdException w:name="Medium Grid 1 Accent 2" w:semiHidden="0" w:uiPriority="67" w:unhideWhenUsed="0"/>
+    <w:lsdException w:name="Medium Grid 2 Accent 2" w:semiHidden="0" w:uiPriority="68" w:unhideWhenUsed="0"/>
+    <w:lsdException w:name="Medium Grid 3 Accent 2" w:semiHidden="0" w:uiPriority="69" w:unhideWhenUsed="0"/>
+    <w:lsdException w:name="Dark List Accent 2" w:semiHidden="0" w:uiPriority="70" w:unhideWhenUsed="0"/>
+    <w:lsdException w:name="Colorful Shading Accent 2" w:semiHidden="0" w:uiPriority="71" w:unhideWhenUsed="0"/>
+    <w:lsdException w:name="Colorful List Accent 2" w:semiHidden="0" w:uiPriority="72" w:unhideWhenUsed="0"/>
+    <w:lsdException w:name="Colorful Grid Accent 2" w:semiHidden="0" w:uiPriority="73" w:unhideWhenUsed="0"/>
+    <w:lsdException w:name="Light Shading Accent 3" w:semiHidden="0" w:uiPriority="60" w:unhideWhenUsed="0"/>
+    <w:lsdException w:name="Light List Accent 3" w:semiHidden="0" w:uiPriority="61" w:unhideWhenUsed="0"/>
+    <w:lsdException w:name="Light Grid Accent 3" w:semiHidden="0" w:uiPriority="62" w:unhideWhenUsed="0"/>
+    <w:lsdException w:name="Medium Shading 1 Accent 3" w:semiHidden="0" w:uiPriority="63" w:unhideWhenUsed="0"/>
+    <w:lsdException w:name="Medium Shading 2 Accent 3" w:semiHidden="0" w:uiPriority="64" w:unhideWhenUsed="0"/>
+    <w:lsdException w:name="Medium List 1 Accent 3" w:semiHidden="0" w:uiPriority="65" w:unhideWhenUsed="0"/>
+    <w:lsdException w:name="Medium List 2 Accent 3" w:semiHidden="0" w:uiPriority="66" w:unhideWhenUsed="0"/>
+    <w:lsdException w:name="Medium Grid 1 Accent 3" w:semiHidden="0" w:uiPriority="67" w:unhideWhenUsed="0"/>
+    <w:lsdException w:name="Medium Grid 2 Accent 3" w:semiHidden="0" w:uiPriority="68" w:unhideWhenUsed="0"/>
+    <w:lsdException w:name="Medium Grid 3 Accent 3" w:semiHidden="0" w:uiPriority="69" w:unhideWhenUsed="0"/>
+    <w:lsdException w:name="Dark List Accent 3" w:semiHidden="0" w:uiPriority="70" w:unhideWhenUsed="0"/>
+    <w:lsdException w:name="Colorful Shading Accent 3" w:semiHidden="0" w:uiPriority="71" w:unhideWhenUsed="0"/>
+    <w:lsdException w:name="Colorful List Accent 3" w:semiHidden="0" w:uiPriority="72" w:unhideWhenUsed="0"/>
+    <w:lsdException w:name="Colorful Grid Accent 3" w:semiHidden="0" w:uiPriority="73" w:unhideWhenUsed="0"/>
+    <w:lsdException w:name="Light Shading Accent 4" w:semiHidden="0" w:uiPriority="60" w:unhideWhenUsed="0"/>
+    <w:lsdException w:name="Light List Accent 4" w:semiHidden="0" w:uiPriority="61" w:unhideWhenUsed="0"/>
+    <w:lsdException w:name="Light Grid Accent 4" w:semiHidden="0" w:uiPriority="62" w:unhideWhenUsed="0"/>
+    <w:lsdException w:name="Medium Shading 1 Accent 4" w:semiHidden="0" w:uiPriority="63" w:unhideWhenUsed="0"/>
+    <w:lsdException w:name="Medium Shading 2 Accent 4" w:semiHidden="0" w:uiPriority="64" w:unhideWhenUsed="0"/>
+    <w:lsdException w:name="Medium List 1 Accent 4" w:semiHidden="0" w:uiPriority="65" w:unhideWhenUsed="0"/>
+    <w:lsdException w:name="Medium List 2 Accent 4" w:semiHidden="0" w:uiPriority="66" w:unhideWhenUsed="0"/>
+    <w:lsdException w:name="Medium Grid 1 Accent 4" w:semiHidden="0" w:uiPriority="67" w:unhideWhenUsed="0"/>
+    <w:lsdException w:name="Medium Grid 2 Accent 4" w:semiHidden="0" w:uiPriority="68" w:unhideWhenUsed="0"/>
+    <w:lsdException w:name="Medium Grid 3 Accent 4" w:semiHidden="0" w:uiPriority="69" w:unhideWhenUsed="0"/>
+    <w:lsdException w:name="Dark List Accent 4" w:semiHidden="0" w:uiPriority="70" w:unhideWhenUsed="0"/>
+    <w:lsdException w:name="Colorful Shading Accent 4" w:semiHidden="0" w:uiPriority="71" w:unhideWhenUsed="0"/>
+    <w:lsdException w:name="Colorful List Accent 4" w:semiHidden="0" w:uiPriority="72" w:unhideWhenUsed="0"/>
+    <w:lsdException w:name="Colorful Grid Accent 4" w:semiHidden="0" w:uiPriority="73" w:unhideWhenUsed="0"/>
+    <w:lsdException w:name="Light Shading Accent 5" w:semiHidden="0" w:uiPriority="60" w:unhideWhenUsed="0"/>
+    <w:lsdException w:name="Light List Accent 5" w:semiHidden="0" w:uiPriority="61" w:unhideWhenUsed="0"/>
+    <w:lsdException w:name="Light Grid Accent 5" w:semiHidden="0" w:uiPriority="62" w:unhideWhenUsed="0"/>
+    <w:lsdException w:name="Medium Shading 1 Accent 5" w:semiHidden="0" w:uiPriority="63" w:unhideWhenUsed="0"/>
+    <w:lsdException w:name="Medium Shading 2 Accent 5" w:semiHidden="0" w:uiPriority="64" w:unhideWhenUsed="0"/>
+    <w:lsdException w:name="Medium List 1 Accent 5" w:semiHidden="0" w:uiPriority="65" w:unhideWhenUsed="0"/>
+    <w:lsdException w:name="Medium List 2 Accent 5" w:semiHidden="0" w:uiPriority="66" w:unhideWhenUsed="0"/>
+    <w:lsdException w:name="Medium Grid 1 Accent 5" w:semiHidden="0" w:uiPriority="67" w:unhideWhenUsed="0"/>
+    <w:lsdException w:name="Medium Grid 2 Accent 5" w:semiHidden="0" w:uiPriority="68" w:unhideWhenUsed="0"/>
+    <w:lsdException w:name="Medium Grid 3 Accent 5" w:semiHidden="0" w:uiPriority="69" w:unhideWhenUsed="0"/>
+    <w:lsdException w:name="Dark List Accent 5" w:semiHidden="0" w:uiPriority="70" w:unhideWhenUsed="0"/>
+    <w:lsdException w:name="Colorful Shading Accent 5" w:semiHidden="0" w:uiPriority="71" w:unhideWhenUsed="0"/>
+    <w:lsdException w:name="Colorful List Accent 5" w:semiHidden="0" w:uiPriority="72" w:unhideWhenUsed="0"/>
+    <w:lsdException w:name="Colorful Grid Accent 5" w:semiHidden="0" w:uiPriority="73" w:unhideWhenUsed="0"/>
+    <w:lsdException w:name="Light Shading Accent 6" w:semiHidden="0" w:uiPriority="60" w:unhideWhenUsed="0"/>
+    <w:lsdException w:name="Light List Accent 6" w:semiHidden="0" w:uiPriority="61" w:unhideWhenUsed="0"/>
+    <w:lsdException w:name="Light Grid Accent 6" w:semiHidden="0" w:uiPriority="62" w:unhideWhenUsed="0"/>
+    <w:lsdException w:name="Medium Shading 1 Accent 6" w:semiHidden="0" w:uiPriority="63" w:unhideWhenUsed="0"/>
+    <w:lsdException w:name="Medium Shading 2 Accent 6" w:semiHidden="0" w:uiPriority="64" w:unhideWhenUsed="0"/>
+    <w:lsdException w:name="Medium List 1 Accent 6" w:semiHidden="0" w:uiPriority="65" w:unhideWhenUsed="0"/>
+    <w:lsdException w:name="Medium List 2 Accent 6" w:semiHidden="0" w:uiPriority="66" w:unhideWhenUsed="0"/>
+    <w:lsdException w:name="Medium Grid 1 Accent 6" w:semiHidden="0" w:uiPriority="67" w:unhideWhenUsed="0"/>
+    <w:lsdException w:name="Medium Grid 2 Accent 6" w:semiHidden="0" w:uiPriority="68" w:unhideWhenUsed="0"/>
+    <w:lsdException w:name="Medium Grid 3 Accent 6" w:semiHidden="0" w:uiPriority="69" w:unhideWhenUsed="0"/>
+    <w:lsdException w:name="Dark List Accent 6" w:semiHidden="0" w:uiPriority="70" w:unhideWhenUsed="0"/>
+    <w:lsdException w:name="Colorful Shading Accent 6" w:semiHidden="0" w:uiPriority="71" w:unhideWhenUsed="0"/>
+    <w:lsdException w:name="Colorful List Accent 6" w:semiHidden="0" w:uiPriority="72" w:unhideWhenUsed="0"/>
+    <w:lsdException w:name="Colorful Grid Accent 6" w:semiHidden="0" w:uiPriority="73" w:unhideWhenUsed="0"/>
+    <w:lsdException w:name="Subtle Emphasis" w:semiHidden="0" w:uiPriority="19" w:unhideWhenUsed="0" w:qFormat="1"/>
+    <w:lsdException w:name="Intense Emphasis" w:semiHidden="0" w:uiPriority="21" w:unhideWhenUsed="0" w:qFormat="1"/>
+    <w:lsdException w:name="Subtle Reference" w:semiHidden="0" w:uiPriority="31" w:unhideWhenUsed="0" w:qFormat="1"/>
+    <w:lsdException w:name="Intense Reference" w:semiHidden="0" w:uiPriority="32" w:unhideWhenUsed="0" w:qFormat="1"/>
+    <w:lsdException w:name="Book Title" w:semiHidden="0" w:uiPriority="33" w:unhideWhenUsed="0" w:qFormat="1"/>
+    <w:lsdException w:name="Bibliography" w:uiPriority="37"/>
+    <w:lsdException w:name="TOC Heading" w:uiPriority="39" w:qFormat="1"/>
   </w:latentStyles>
   <w:style w:type="paragraph" w:default="1" w:styleId="Normal">
     <w:name w:val="Normal"/>
@@ -2835,14 +2860,14 @@
       <w:keepNext/>
       <w:keepLines/>
       <w:pBdr>
-        <w:bottom w:val="single" w:sz="4" w:space="1" w:color="99CB38" w:themeColor="accent1"/>
+        <w:bottom w:val="single" w:sz="4" w:space="1" w:color="F07F09" w:themeColor="accent1"/>
       </w:pBdr>
       <w:spacing w:before="400" w:after="40" w:line="240" w:lineRule="auto"/>
       <w:outlineLvl w:val="0"/>
     </w:pPr>
     <w:rPr>
       <w:rFonts w:asciiTheme="majorHAnsi" w:eastAsiaTheme="majorEastAsia" w:hAnsiTheme="majorHAnsi" w:cstheme="majorBidi"/>
-      <w:color w:val="729928" w:themeColor="accent1" w:themeShade="BF"/>
+      <w:color w:val="B35E06" w:themeColor="accent1" w:themeShade="BF"/>
       <w:sz w:val="36"/>
       <w:szCs w:val="36"/>
     </w:rPr>
@@ -2864,7 +2889,7 @@
     </w:pPr>
     <w:rPr>
       <w:rFonts w:asciiTheme="majorHAnsi" w:eastAsiaTheme="majorEastAsia" w:hAnsiTheme="majorHAnsi" w:cstheme="majorBidi"/>
-      <w:color w:val="729928" w:themeColor="accent1" w:themeShade="BF"/>
+      <w:color w:val="B35E06" w:themeColor="accent1" w:themeShade="BF"/>
       <w:sz w:val="28"/>
       <w:szCs w:val="28"/>
     </w:rPr>
@@ -3038,6 +3063,7 @@
     <w:uiPriority w:val="99"/>
     <w:semiHidden/>
     <w:unhideWhenUsed/>
+    <w:qFormat/>
     <w:tblPr>
       <w:tblInd w:w="0" w:type="dxa"/>
       <w:tblCellMar>
@@ -3062,7 +3088,7 @@
     <w:rsid w:val="00510687"/>
     <w:rPr>
       <w:rFonts w:asciiTheme="majorHAnsi" w:eastAsiaTheme="majorEastAsia" w:hAnsiTheme="majorHAnsi" w:cstheme="majorBidi"/>
-      <w:color w:val="729928" w:themeColor="accent1" w:themeShade="BF"/>
+      <w:color w:val="B35E06" w:themeColor="accent1" w:themeShade="BF"/>
       <w:sz w:val="36"/>
       <w:szCs w:val="36"/>
     </w:rPr>
@@ -3081,7 +3107,7 @@
     </w:pPr>
     <w:rPr>
       <w:rFonts w:asciiTheme="majorHAnsi" w:eastAsiaTheme="majorEastAsia" w:hAnsiTheme="majorHAnsi" w:cstheme="majorBidi"/>
-      <w:color w:val="729928" w:themeColor="accent1" w:themeShade="BF"/>
+      <w:color w:val="B35E06" w:themeColor="accent1" w:themeShade="BF"/>
       <w:spacing w:val="-7"/>
       <w:sz w:val="80"/>
       <w:szCs w:val="80"/>
@@ -3095,7 +3121,7 @@
     <w:rsid w:val="00510687"/>
     <w:rPr>
       <w:rFonts w:asciiTheme="majorHAnsi" w:eastAsiaTheme="majorEastAsia" w:hAnsiTheme="majorHAnsi" w:cstheme="majorBidi"/>
-      <w:color w:val="729928" w:themeColor="accent1" w:themeShade="BF"/>
+      <w:color w:val="B35E06" w:themeColor="accent1" w:themeShade="BF"/>
       <w:spacing w:val="-7"/>
       <w:sz w:val="80"/>
       <w:szCs w:val="80"/>
@@ -3109,7 +3135,7 @@
     <w:rsid w:val="00510687"/>
     <w:rPr>
       <w:rFonts w:asciiTheme="majorHAnsi" w:eastAsiaTheme="majorEastAsia" w:hAnsiTheme="majorHAnsi" w:cstheme="majorBidi"/>
-      <w:color w:val="729928" w:themeColor="accent1" w:themeShade="BF"/>
+      <w:color w:val="B35E06" w:themeColor="accent1" w:themeShade="BF"/>
       <w:sz w:val="28"/>
       <w:szCs w:val="28"/>
     </w:rPr>
@@ -3287,6 +3313,7 @@
   </w:style>
   <w:style w:type="paragraph" w:styleId="NoSpacing">
     <w:name w:val="No Spacing"/>
+    <w:link w:val="NoSpacingChar"/>
     <w:uiPriority w:val="1"/>
     <w:qFormat/>
     <w:rsid w:val="00510687"/>
@@ -3338,7 +3365,7 @@
     </w:pPr>
     <w:rPr>
       <w:rFonts w:asciiTheme="majorHAnsi" w:eastAsiaTheme="majorEastAsia" w:hAnsiTheme="majorHAnsi" w:cstheme="majorBidi"/>
-      <w:color w:val="99CB38" w:themeColor="accent1"/>
+      <w:color w:val="F07F09" w:themeColor="accent1"/>
       <w:sz w:val="28"/>
       <w:szCs w:val="28"/>
     </w:rPr>
@@ -3351,7 +3378,7 @@
     <w:rsid w:val="00510687"/>
     <w:rPr>
       <w:rFonts w:asciiTheme="majorHAnsi" w:eastAsiaTheme="majorEastAsia" w:hAnsiTheme="majorHAnsi" w:cstheme="majorBidi"/>
-      <w:color w:val="99CB38" w:themeColor="accent1"/>
+      <w:color w:val="F07F09" w:themeColor="accent1"/>
       <w:sz w:val="28"/>
       <w:szCs w:val="28"/>
     </w:rPr>
@@ -3461,7 +3488,7 @@
     <w:unhideWhenUsed/>
     <w:rsid w:val="00362B52"/>
     <w:rPr>
-      <w:color w:val="EE7B08" w:themeColor="hyperlink"/>
+      <w:color w:val="6B9F25" w:themeColor="hyperlink"/>
       <w:u w:val="single"/>
     </w:rPr>
   </w:style>
@@ -3506,13 +3533,492 @@
       <w:contextualSpacing/>
     </w:pPr>
   </w:style>
+  <w:style w:type="character" w:customStyle="1" w:styleId="NoSpacingChar">
+    <w:name w:val="No Spacing Char"/>
+    <w:basedOn w:val="DefaultParagraphFont"/>
+    <w:link w:val="NoSpacing"/>
+    <w:uiPriority w:val="1"/>
+    <w:rsid w:val="00690C89"/>
+  </w:style>
 </w:styles>
+</file>
+
+<file path=word/glossary/document.xml><?xml version="1.0" encoding="utf-8"?>
+<w:glossaryDocument xmlns:ve="http://schemas.openxmlformats.org/markup-compatibility/2006" xmlns:o="urn:schemas-microsoft-com:office:office" xmlns:r="http://schemas.openxmlformats.org/officeDocument/2006/relationships" xmlns:m="http://schemas.openxmlformats.org/officeDocument/2006/math" xmlns:v="urn:schemas-microsoft-com:vml" xmlns:wp="http://schemas.openxmlformats.org/drawingml/2006/wordprocessingDrawing" xmlns:w10="urn:schemas-microsoft-com:office:word" xmlns:w="http://schemas.openxmlformats.org/wordprocessingml/2006/main" xmlns:wne="http://schemas.microsoft.com/office/word/2006/wordml">
+  <w:docParts>
+    <w:docPart>
+      <w:docPartPr>
+        <w:name w:val="8C35D953F0D442758A57F7720D14363B"/>
+        <w:category>
+          <w:name w:val="General"/>
+          <w:gallery w:val="placeholder"/>
+        </w:category>
+        <w:types>
+          <w:type w:val="bbPlcHdr"/>
+        </w:types>
+        <w:behaviors>
+          <w:behavior w:val="content"/>
+        </w:behaviors>
+        <w:guid w:val="{F3C22044-9E6B-43E7-ACB6-D404B1B52F2D}"/>
+      </w:docPartPr>
+      <w:docPartBody>
+        <w:p>
+          <w:pPr>
+            <w:pStyle w:val="8C35D953F0D442758A57F7720D14363B"/>
+          </w:pPr>
+          <w:r>
+            <w:rPr>
+              <w:rFonts w:asciiTheme="majorHAnsi" w:eastAsiaTheme="majorEastAsia" w:hAnsiTheme="majorHAnsi" w:cstheme="majorBidi"/>
+              <w:caps/>
+            </w:rPr>
+            <w:t>[Type the company name]</w:t>
+          </w:r>
+        </w:p>
+      </w:docPartBody>
+    </w:docPart>
+    <w:docPart>
+      <w:docPartPr>
+        <w:name w:val="7F64B2AD64114EA7B5FD54AC2C2D5493"/>
+        <w:category>
+          <w:name w:val="General"/>
+          <w:gallery w:val="placeholder"/>
+        </w:category>
+        <w:types>
+          <w:type w:val="bbPlcHdr"/>
+        </w:types>
+        <w:behaviors>
+          <w:behavior w:val="content"/>
+        </w:behaviors>
+        <w:guid w:val="{1C87D9F7-C5CF-48F4-BD72-3E80321B72E6}"/>
+      </w:docPartPr>
+      <w:docPartBody>
+        <w:p>
+          <w:pPr>
+            <w:pStyle w:val="7F64B2AD64114EA7B5FD54AC2C2D5493"/>
+          </w:pPr>
+          <w:r>
+            <w:rPr>
+              <w:rFonts w:asciiTheme="majorHAnsi" w:eastAsiaTheme="majorEastAsia" w:hAnsiTheme="majorHAnsi" w:cstheme="majorBidi"/>
+              <w:sz w:val="80"/>
+              <w:szCs w:val="80"/>
+            </w:rPr>
+            <w:t>[Type the document title]</w:t>
+          </w:r>
+        </w:p>
+      </w:docPartBody>
+    </w:docPart>
+    <w:docPart>
+      <w:docPartPr>
+        <w:name w:val="3F999BE63CD04C79A55A40D73867033F"/>
+        <w:category>
+          <w:name w:val="General"/>
+          <w:gallery w:val="placeholder"/>
+        </w:category>
+        <w:types>
+          <w:type w:val="bbPlcHdr"/>
+        </w:types>
+        <w:behaviors>
+          <w:behavior w:val="content"/>
+        </w:behaviors>
+        <w:guid w:val="{E92C2E27-24EE-4667-9C7C-E2F2EF9DFB7A}"/>
+      </w:docPartPr>
+      <w:docPartBody>
+        <w:p>
+          <w:pPr>
+            <w:pStyle w:val="3F999BE63CD04C79A55A40D73867033F"/>
+          </w:pPr>
+          <w:r>
+            <w:rPr>
+              <w:rFonts w:asciiTheme="majorHAnsi" w:eastAsiaTheme="majorEastAsia" w:hAnsiTheme="majorHAnsi" w:cstheme="majorBidi"/>
+              <w:sz w:val="44"/>
+              <w:szCs w:val="44"/>
+            </w:rPr>
+            <w:t>[Type the document subtitle]</w:t>
+          </w:r>
+        </w:p>
+      </w:docPartBody>
+    </w:docPart>
+    <w:docPart>
+      <w:docPartPr>
+        <w:name w:val="024CEE8A25B342488081DE2D78E0421A"/>
+        <w:category>
+          <w:name w:val="General"/>
+          <w:gallery w:val="placeholder"/>
+        </w:category>
+        <w:types>
+          <w:type w:val="bbPlcHdr"/>
+        </w:types>
+        <w:behaviors>
+          <w:behavior w:val="content"/>
+        </w:behaviors>
+        <w:guid w:val="{4E501FF7-5DE7-4C3D-8BE4-9FA554B50743}"/>
+      </w:docPartPr>
+      <w:docPartBody>
+        <w:p>
+          <w:pPr>
+            <w:pStyle w:val="024CEE8A25B342488081DE2D78E0421A"/>
+          </w:pPr>
+          <w:r>
+            <w:rPr>
+              <w:b/>
+              <w:bCs/>
+            </w:rPr>
+            <w:t>[Type the author name]</w:t>
+          </w:r>
+        </w:p>
+      </w:docPartBody>
+    </w:docPart>
+  </w:docParts>
+</w:glossaryDocument>
+</file>
+
+<file path=word/glossary/fontTable.xml><?xml version="1.0" encoding="utf-8"?>
+<w:fonts xmlns:r="http://schemas.openxmlformats.org/officeDocument/2006/relationships" xmlns:w="http://schemas.openxmlformats.org/wordprocessingml/2006/main">
+  <w:font w:name="Symbol">
+    <w:panose1 w:val="05050102010706020507"/>
+    <w:charset w:val="02"/>
+    <w:family w:val="roman"/>
+    <w:pitch w:val="variable"/>
+    <w:sig w:usb0="00000000" w:usb1="10000000" w:usb2="00000000" w:usb3="00000000" w:csb0="80000000" w:csb1="00000000"/>
+  </w:font>
+  <w:font w:name="Times New Roman">
+    <w:panose1 w:val="02020603050405020304"/>
+    <w:charset w:val="00"/>
+    <w:family w:val="roman"/>
+    <w:pitch w:val="variable"/>
+    <w:sig w:usb0="E0002EFF" w:usb1="C0007843" w:usb2="00000009" w:usb3="00000000" w:csb0="000001FF" w:csb1="00000000"/>
+  </w:font>
+  <w:font w:name="Courier New">
+    <w:panose1 w:val="02070309020205020404"/>
+    <w:charset w:val="00"/>
+    <w:family w:val="modern"/>
+    <w:pitch w:val="fixed"/>
+    <w:sig w:usb0="E0002AFF" w:usb1="C0007843" w:usb2="00000009" w:usb3="00000000" w:csb0="000001FF" w:csb1="00000000"/>
+  </w:font>
+  <w:font w:name="Wingdings">
+    <w:panose1 w:val="05000000000000000000"/>
+    <w:charset w:val="02"/>
+    <w:family w:val="auto"/>
+    <w:pitch w:val="variable"/>
+    <w:sig w:usb0="00000000" w:usb1="10000000" w:usb2="00000000" w:usb3="00000000" w:csb0="80000000" w:csb1="00000000"/>
+  </w:font>
+  <w:font w:name="Trebuchet MS">
+    <w:panose1 w:val="020B0603020202020204"/>
+    <w:charset w:val="00"/>
+    <w:family w:val="swiss"/>
+    <w:pitch w:val="variable"/>
+    <w:sig w:usb0="00000287" w:usb1="00000003" w:usb2="00000000" w:usb3="00000000" w:csb0="0000009F" w:csb1="00000000"/>
+  </w:font>
+  <w:font w:name="Tahoma">
+    <w:panose1 w:val="020B0604030504040204"/>
+    <w:charset w:val="00"/>
+    <w:family w:val="swiss"/>
+    <w:pitch w:val="variable"/>
+    <w:sig w:usb0="E1002EFF" w:usb1="C000605B" w:usb2="00000029" w:usb3="00000000" w:csb0="000101FF" w:csb1="00000000"/>
+  </w:font>
+  <w:font w:name="Calibri">
+    <w:panose1 w:val="020F0502020204030204"/>
+    <w:charset w:val="00"/>
+    <w:family w:val="swiss"/>
+    <w:pitch w:val="variable"/>
+    <w:sig w:usb0="E00002FF" w:usb1="4000ACFF" w:usb2="00000001" w:usb3="00000000" w:csb0="0000019F" w:csb1="00000000"/>
+  </w:font>
+  <w:font w:name="Cambria">
+    <w:panose1 w:val="02040503050406030204"/>
+    <w:charset w:val="00"/>
+    <w:family w:val="roman"/>
+    <w:pitch w:val="variable"/>
+    <w:sig w:usb0="E00002FF" w:usb1="400004FF" w:usb2="00000000" w:usb3="00000000" w:csb0="0000019F" w:csb1="00000000"/>
+  </w:font>
+</w:fonts>
+</file>
+
+<file path=word/glossary/settings.xml><?xml version="1.0" encoding="utf-8"?>
+<w:settings xmlns:o="urn:schemas-microsoft-com:office:office" xmlns:r="http://schemas.openxmlformats.org/officeDocument/2006/relationships" xmlns:m="http://schemas.openxmlformats.org/officeDocument/2006/math" xmlns:v="urn:schemas-microsoft-com:vml" xmlns:w10="urn:schemas-microsoft-com:office:word" xmlns:w="http://schemas.openxmlformats.org/wordprocessingml/2006/main" xmlns:sl="http://schemas.openxmlformats.org/schemaLibrary/2006/main">
+  <w:view w:val="normal"/>
+  <w:defaultTabStop w:val="720"/>
+  <w:characterSpacingControl w:val="doNotCompress"/>
+  <w:compat>
+    <w:useFELayout/>
+  </w:compat>
+  <w:rsids>
+    <w:rsidRoot w:val="007A6147"/>
+    <w:rsid w:val="007A6147"/>
+    <w:rsid w:val="00B41314"/>
+  </w:rsids>
+  <m:mathPr>
+    <m:mathFont m:val="Cambria Math"/>
+    <m:brkBin m:val="before"/>
+    <m:brkBinSub m:val="--"/>
+    <m:smallFrac m:val="off"/>
+    <m:dispDef/>
+    <m:lMargin m:val="0"/>
+    <m:rMargin m:val="0"/>
+    <m:defJc m:val="centerGroup"/>
+    <m:wrapIndent m:val="1440"/>
+    <m:intLim m:val="subSup"/>
+    <m:naryLim m:val="undOvr"/>
+  </m:mathPr>
+  <w:themeFontLang w:val="en-CA"/>
+  <w:clrSchemeMapping w:bg1="light1" w:t1="dark1" w:bg2="light2" w:t2="dark2" w:accent1="accent1" w:accent2="accent2" w:accent3="accent3" w:accent4="accent4" w:accent5="accent5" w:accent6="accent6" w:hyperlink="hyperlink" w:followedHyperlink="followedHyperlink"/>
+  <w:decimalSymbol w:val="."/>
+  <w:listSeparator w:val=","/>
+</w:settings>
+</file>
+
+<file path=word/glossary/styles.xml><?xml version="1.0" encoding="utf-8"?>
+<w:styles xmlns:r="http://schemas.openxmlformats.org/officeDocument/2006/relationships" xmlns:w="http://schemas.openxmlformats.org/wordprocessingml/2006/main">
+  <w:docDefaults>
+    <w:rPrDefault>
+      <w:rPr>
+        <w:rFonts w:asciiTheme="minorHAnsi" w:eastAsiaTheme="minorEastAsia" w:hAnsiTheme="minorHAnsi" w:cstheme="minorBidi"/>
+        <w:sz w:val="22"/>
+        <w:szCs w:val="22"/>
+        <w:lang w:val="en-CA" w:eastAsia="en-CA" w:bidi="ar-SA"/>
+      </w:rPr>
+    </w:rPrDefault>
+    <w:pPrDefault>
+      <w:pPr>
+        <w:spacing w:after="200" w:line="276" w:lineRule="auto"/>
+      </w:pPr>
+    </w:pPrDefault>
+  </w:docDefaults>
+  <w:latentStyles w:defLockedState="0" w:defUIPriority="99" w:defSemiHidden="1" w:defUnhideWhenUsed="1" w:defQFormat="0" w:count="267">
+    <w:lsdException w:name="Normal" w:semiHidden="0" w:uiPriority="0" w:unhideWhenUsed="0" w:qFormat="1"/>
+    <w:lsdException w:name="heading 1" w:semiHidden="0" w:uiPriority="9" w:unhideWhenUsed="0" w:qFormat="1"/>
+    <w:lsdException w:name="heading 2" w:uiPriority="9" w:qFormat="1"/>
+    <w:lsdException w:name="heading 3" w:uiPriority="9" w:qFormat="1"/>
+    <w:lsdException w:name="heading 4" w:uiPriority="9" w:qFormat="1"/>
+    <w:lsdException w:name="heading 5" w:uiPriority="9" w:qFormat="1"/>
+    <w:lsdException w:name="heading 6" w:uiPriority="9" w:qFormat="1"/>
+    <w:lsdException w:name="heading 7" w:uiPriority="9" w:qFormat="1"/>
+    <w:lsdException w:name="heading 8" w:uiPriority="9" w:qFormat="1"/>
+    <w:lsdException w:name="heading 9" w:uiPriority="9" w:qFormat="1"/>
+    <w:lsdException w:name="toc 1" w:uiPriority="39"/>
+    <w:lsdException w:name="toc 2" w:uiPriority="39"/>
+    <w:lsdException w:name="toc 3" w:uiPriority="39"/>
+    <w:lsdException w:name="toc 4" w:uiPriority="39"/>
+    <w:lsdException w:name="toc 5" w:uiPriority="39"/>
+    <w:lsdException w:name="toc 6" w:uiPriority="39"/>
+    <w:lsdException w:name="toc 7" w:uiPriority="39"/>
+    <w:lsdException w:name="toc 8" w:uiPriority="39"/>
+    <w:lsdException w:name="toc 9" w:uiPriority="39"/>
+    <w:lsdException w:name="caption" w:uiPriority="35" w:qFormat="1"/>
+    <w:lsdException w:name="Title" w:semiHidden="0" w:uiPriority="10" w:unhideWhenUsed="0" w:qFormat="1"/>
+    <w:lsdException w:name="Default Paragraph Font" w:uiPriority="1"/>
+    <w:lsdException w:name="Subtitle" w:semiHidden="0" w:uiPriority="11" w:unhideWhenUsed="0" w:qFormat="1"/>
+    <w:lsdException w:name="Strong" w:semiHidden="0" w:uiPriority="22" w:unhideWhenUsed="0" w:qFormat="1"/>
+    <w:lsdException w:name="Emphasis" w:semiHidden="0" w:uiPriority="20" w:unhideWhenUsed="0" w:qFormat="1"/>
+    <w:lsdException w:name="Table Grid" w:semiHidden="0" w:uiPriority="59" w:unhideWhenUsed="0"/>
+    <w:lsdException w:name="Placeholder Text" w:unhideWhenUsed="0"/>
+    <w:lsdException w:name="No Spacing" w:semiHidden="0" w:uiPriority="1" w:unhideWhenUsed="0" w:qFormat="1"/>
+    <w:lsdException w:name="Light Shading" w:semiHidden="0" w:uiPriority="60" w:unhideWhenUsed="0"/>
+    <w:lsdException w:name="Light List" w:semiHidden="0" w:uiPriority="61" w:unhideWhenUsed="0"/>
+    <w:lsdException w:name="Light Grid" w:semiHidden="0" w:uiPriority="62" w:unhideWhenUsed="0"/>
+    <w:lsdException w:name="Medium Shading 1" w:semiHidden="0" w:uiPriority="63" w:unhideWhenUsed="0"/>
+    <w:lsdException w:name="Medium Shading 2" w:semiHidden="0" w:uiPriority="64" w:unhideWhenUsed="0"/>
+    <w:lsdException w:name="Medium List 1" w:semiHidden="0" w:uiPriority="65" w:unhideWhenUsed="0"/>
+    <w:lsdException w:name="Medium List 2" w:semiHidden="0" w:uiPriority="66" w:unhideWhenUsed="0"/>
+    <w:lsdException w:name="Medium Grid 1" w:semiHidden="0" w:uiPriority="67" w:unhideWhenUsed="0"/>
+    <w:lsdException w:name="Medium Grid 2" w:semiHidden="0" w:uiPriority="68" w:unhideWhenUsed="0"/>
+    <w:lsdException w:name="Medium Grid 3" w:semiHidden="0" w:uiPriority="69" w:unhideWhenUsed="0"/>
+    <w:lsdException w:name="Dark List" w:semiHidden="0" w:uiPriority="70" w:unhideWhenUsed="0"/>
+    <w:lsdException w:name="Colorful Shading" w:semiHidden="0" w:uiPriority="71" w:unhideWhenUsed="0"/>
+    <w:lsdException w:name="Colorful List" w:semiHidden="0" w:uiPriority="72" w:unhideWhenUsed="0"/>
+    <w:lsdException w:name="Colorful Grid" w:semiHidden="0" w:uiPriority="73" w:unhideWhenUsed="0"/>
+    <w:lsdException w:name="Light Shading Accent 1" w:semiHidden="0" w:uiPriority="60" w:unhideWhenUsed="0"/>
+    <w:lsdException w:name="Light List Accent 1" w:semiHidden="0" w:uiPriority="61" w:unhideWhenUsed="0"/>
+    <w:lsdException w:name="Light Grid Accent 1" w:semiHidden="0" w:uiPriority="62" w:unhideWhenUsed="0"/>
+    <w:lsdException w:name="Medium Shading 1 Accent 1" w:semiHidden="0" w:uiPriority="63" w:unhideWhenUsed="0"/>
+    <w:lsdException w:name="Medium Shading 2 Accent 1" w:semiHidden="0" w:uiPriority="64" w:unhideWhenUsed="0"/>
+    <w:lsdException w:name="Medium List 1 Accent 1" w:semiHidden="0" w:uiPriority="65" w:unhideWhenUsed="0"/>
+    <w:lsdException w:name="Revision" w:unhideWhenUsed="0"/>
+    <w:lsdException w:name="List Paragraph" w:semiHidden="0" w:uiPriority="34" w:unhideWhenUsed="0" w:qFormat="1"/>
+    <w:lsdException w:name="Quote" w:semiHidden="0" w:uiPriority="29" w:unhideWhenUsed="0" w:qFormat="1"/>
+    <w:lsdException w:name="Intense Quote" w:semiHidden="0" w:uiPriority="30" w:unhideWhenUsed="0" w:qFormat="1"/>
+    <w:lsdException w:name="Medium List 2 Accent 1" w:semiHidden="0" w:uiPriority="66" w:unhideWhenUsed="0"/>
+    <w:lsdException w:name="Medium Grid 1 Accent 1" w:semiHidden="0" w:uiPriority="67" w:unhideWhenUsed="0"/>
+    <w:lsdException w:name="Medium Grid 2 Accent 1" w:semiHidden="0" w:uiPriority="68" w:unhideWhenUsed="0"/>
+    <w:lsdException w:name="Medium Grid 3 Accent 1" w:semiHidden="0" w:uiPriority="69" w:unhideWhenUsed="0"/>
+    <w:lsdException w:name="Dark List Accent 1" w:semiHidden="0" w:uiPriority="70" w:unhideWhenUsed="0"/>
+    <w:lsdException w:name="Colorful Shading Accent 1" w:semiHidden="0" w:uiPriority="71" w:unhideWhenUsed="0"/>
+    <w:lsdException w:name="Colorful List Accent 1" w:semiHidden="0" w:uiPriority="72" w:unhideWhenUsed="0"/>
+    <w:lsdException w:name="Colorful Grid Accent 1" w:semiHidden="0" w:uiPriority="73" w:unhideWhenUsed="0"/>
+    <w:lsdException w:name="Light Shading Accent 2" w:semiHidden="0" w:uiPriority="60" w:unhideWhenUsed="0"/>
+    <w:lsdException w:name="Light List Accent 2" w:semiHidden="0" w:uiPriority="61" w:unhideWhenUsed="0"/>
+    <w:lsdException w:name="Light Grid Accent 2" w:semiHidden="0" w:uiPriority="62" w:unhideWhenUsed="0"/>
+    <w:lsdException w:name="Medium Shading 1 Accent 2" w:semiHidden="0" w:uiPriority="63" w:unhideWhenUsed="0"/>
+    <w:lsdException w:name="Medium Shading 2 Accent 2" w:semiHidden="0" w:uiPriority="64" w:unhideWhenUsed="0"/>
+    <w:lsdException w:name="Medium List 1 Accent 2" w:semiHidden="0" w:uiPriority="65" w:unhideWhenUsed="0"/>
+    <w:lsdException w:name="Medium List 2 Accent 2" w:semiHidden="0" w:uiPriority="66" w:unhideWhenUsed="0"/>
+    <w:lsdException w:name="Medium Grid 1 Accent 2" w:semiHidden="0" w:uiPriority="67" w:unhideWhenUsed="0"/>
+    <w:lsdException w:name="Medium Grid 2 Accent 2" w:semiHidden="0" w:uiPriority="68" w:unhideWhenUsed="0"/>
+    <w:lsdException w:name="Medium Grid 3 Accent 2" w:semiHidden="0" w:uiPriority="69" w:unhideWhenUsed="0"/>
+    <w:lsdException w:name="Dark List Accent 2" w:semiHidden="0" w:uiPriority="70" w:unhideWhenUsed="0"/>
+    <w:lsdException w:name="Colorful Shading Accent 2" w:semiHidden="0" w:uiPriority="71" w:unhideWhenUsed="0"/>
+    <w:lsdException w:name="Colorful List Accent 2" w:semiHidden="0" w:uiPriority="72" w:unhideWhenUsed="0"/>
+    <w:lsdException w:name="Colorful Grid Accent 2" w:semiHidden="0" w:uiPriority="73" w:unhideWhenUsed="0"/>
+    <w:lsdException w:name="Light Shading Accent 3" w:semiHidden="0" w:uiPriority="60" w:unhideWhenUsed="0"/>
+    <w:lsdException w:name="Light List Accent 3" w:semiHidden="0" w:uiPriority="61" w:unhideWhenUsed="0"/>
+    <w:lsdException w:name="Light Grid Accent 3" w:semiHidden="0" w:uiPriority="62" w:unhideWhenUsed="0"/>
+    <w:lsdException w:name="Medium Shading 1 Accent 3" w:semiHidden="0" w:uiPriority="63" w:unhideWhenUsed="0"/>
+    <w:lsdException w:name="Medium Shading 2 Accent 3" w:semiHidden="0" w:uiPriority="64" w:unhideWhenUsed="0"/>
+    <w:lsdException w:name="Medium List 1 Accent 3" w:semiHidden="0" w:uiPriority="65" w:unhideWhenUsed="0"/>
+    <w:lsdException w:name="Medium List 2 Accent 3" w:semiHidden="0" w:uiPriority="66" w:unhideWhenUsed="0"/>
+    <w:lsdException w:name="Medium Grid 1 Accent 3" w:semiHidden="0" w:uiPriority="67" w:unhideWhenUsed="0"/>
+    <w:lsdException w:name="Medium Grid 2 Accent 3" w:semiHidden="0" w:uiPriority="68" w:unhideWhenUsed="0"/>
+    <w:lsdException w:name="Medium Grid 3 Accent 3" w:semiHidden="0" w:uiPriority="69" w:unhideWhenUsed="0"/>
+    <w:lsdException w:name="Dark List Accent 3" w:semiHidden="0" w:uiPriority="70" w:unhideWhenUsed="0"/>
+    <w:lsdException w:name="Colorful Shading Accent 3" w:semiHidden="0" w:uiPriority="71" w:unhideWhenUsed="0"/>
+    <w:lsdException w:name="Colorful List Accent 3" w:semiHidden="0" w:uiPriority="72" w:unhideWhenUsed="0"/>
+    <w:lsdException w:name="Colorful Grid Accent 3" w:semiHidden="0" w:uiPriority="73" w:unhideWhenUsed="0"/>
+    <w:lsdException w:name="Light Shading Accent 4" w:semiHidden="0" w:uiPriority="60" w:unhideWhenUsed="0"/>
+    <w:lsdException w:name="Light List Accent 4" w:semiHidden="0" w:uiPriority="61" w:unhideWhenUsed="0"/>
+    <w:lsdException w:name="Light Grid Accent 4" w:semiHidden="0" w:uiPriority="62" w:unhideWhenUsed="0"/>
+    <w:lsdException w:name="Medium Shading 1 Accent 4" w:semiHidden="0" w:uiPriority="63" w:unhideWhenUsed="0"/>
+    <w:lsdException w:name="Medium Shading 2 Accent 4" w:semiHidden="0" w:uiPriority="64" w:unhideWhenUsed="0"/>
+    <w:lsdException w:name="Medium List 1 Accent 4" w:semiHidden="0" w:uiPriority="65" w:unhideWhenUsed="0"/>
+    <w:lsdException w:name="Medium List 2 Accent 4" w:semiHidden="0" w:uiPriority="66" w:unhideWhenUsed="0"/>
+    <w:lsdException w:name="Medium Grid 1 Accent 4" w:semiHidden="0" w:uiPriority="67" w:unhideWhenUsed="0"/>
+    <w:lsdException w:name="Medium Grid 2 Accent 4" w:semiHidden="0" w:uiPriority="68" w:unhideWhenUsed="0"/>
+    <w:lsdException w:name="Medium Grid 3 Accent 4" w:semiHidden="0" w:uiPriority="69" w:unhideWhenUsed="0"/>
+    <w:lsdException w:name="Dark List Accent 4" w:semiHidden="0" w:uiPriority="70" w:unhideWhenUsed="0"/>
+    <w:lsdException w:name="Colorful Shading Accent 4" w:semiHidden="0" w:uiPriority="71" w:unhideWhenUsed="0"/>
+    <w:lsdException w:name="Colorful List Accent 4" w:semiHidden="0" w:uiPriority="72" w:unhideWhenUsed="0"/>
+    <w:lsdException w:name="Colorful Grid Accent 4" w:semiHidden="0" w:uiPriority="73" w:unhideWhenUsed="0"/>
+    <w:lsdException w:name="Light Shading Accent 5" w:semiHidden="0" w:uiPriority="60" w:unhideWhenUsed="0"/>
+    <w:lsdException w:name="Light List Accent 5" w:semiHidden="0" w:uiPriority="61" w:unhideWhenUsed="0"/>
+    <w:lsdException w:name="Light Grid Accent 5" w:semiHidden="0" w:uiPriority="62" w:unhideWhenUsed="0"/>
+    <w:lsdException w:name="Medium Shading 1 Accent 5" w:semiHidden="0" w:uiPriority="63" w:unhideWhenUsed="0"/>
+    <w:lsdException w:name="Medium Shading 2 Accent 5" w:semiHidden="0" w:uiPriority="64" w:unhideWhenUsed="0"/>
+    <w:lsdException w:name="Medium List 1 Accent 5" w:semiHidden="0" w:uiPriority="65" w:unhideWhenUsed="0"/>
+    <w:lsdException w:name="Medium List 2 Accent 5" w:semiHidden="0" w:uiPriority="66" w:unhideWhenUsed="0"/>
+    <w:lsdException w:name="Medium Grid 1 Accent 5" w:semiHidden="0" w:uiPriority="67" w:unhideWhenUsed="0"/>
+    <w:lsdException w:name="Medium Grid 2 Accent 5" w:semiHidden="0" w:uiPriority="68" w:unhideWhenUsed="0"/>
+    <w:lsdException w:name="Medium Grid 3 Accent 5" w:semiHidden="0" w:uiPriority="69" w:unhideWhenUsed="0"/>
+    <w:lsdException w:name="Dark List Accent 5" w:semiHidden="0" w:uiPriority="70" w:unhideWhenUsed="0"/>
+    <w:lsdException w:name="Colorful Shading Accent 5" w:semiHidden="0" w:uiPriority="71" w:unhideWhenUsed="0"/>
+    <w:lsdException w:name="Colorful List Accent 5" w:semiHidden="0" w:uiPriority="72" w:unhideWhenUsed="0"/>
+    <w:lsdException w:name="Colorful Grid Accent 5" w:semiHidden="0" w:uiPriority="73" w:unhideWhenUsed="0"/>
+    <w:lsdException w:name="Light Shading Accent 6" w:semiHidden="0" w:uiPriority="60" w:unhideWhenUsed="0"/>
+    <w:lsdException w:name="Light List Accent 6" w:semiHidden="0" w:uiPriority="61" w:unhideWhenUsed="0"/>
+    <w:lsdException w:name="Light Grid Accent 6" w:semiHidden="0" w:uiPriority="62" w:unhideWhenUsed="0"/>
+    <w:lsdException w:name="Medium Shading 1 Accent 6" w:semiHidden="0" w:uiPriority="63" w:unhideWhenUsed="0"/>
+    <w:lsdException w:name="Medium Shading 2 Accent 6" w:semiHidden="0" w:uiPriority="64" w:unhideWhenUsed="0"/>
+    <w:lsdException w:name="Medium List 1 Accent 6" w:semiHidden="0" w:uiPriority="65" w:unhideWhenUsed="0"/>
+    <w:lsdException w:name="Medium List 2 Accent 6" w:semiHidden="0" w:uiPriority="66" w:unhideWhenUsed="0"/>
+    <w:lsdException w:name="Medium Grid 1 Accent 6" w:semiHidden="0" w:uiPriority="67" w:unhideWhenUsed="0"/>
+    <w:lsdException w:name="Medium Grid 2 Accent 6" w:semiHidden="0" w:uiPriority="68" w:unhideWhenUsed="0"/>
+    <w:lsdException w:name="Medium Grid 3 Accent 6" w:semiHidden="0" w:uiPriority="69" w:unhideWhenUsed="0"/>
+    <w:lsdException w:name="Dark List Accent 6" w:semiHidden="0" w:uiPriority="70" w:unhideWhenUsed="0"/>
+    <w:lsdException w:name="Colorful Shading Accent 6" w:semiHidden="0" w:uiPriority="71" w:unhideWhenUsed="0"/>
+    <w:lsdException w:name="Colorful List Accent 6" w:semiHidden="0" w:uiPriority="72" w:unhideWhenUsed="0"/>
+    <w:lsdException w:name="Colorful Grid Accent 6" w:semiHidden="0" w:uiPriority="73" w:unhideWhenUsed="0"/>
+    <w:lsdException w:name="Subtle Emphasis" w:semiHidden="0" w:uiPriority="19" w:unhideWhenUsed="0" w:qFormat="1"/>
+    <w:lsdException w:name="Intense Emphasis" w:semiHidden="0" w:uiPriority="21" w:unhideWhenUsed="0" w:qFormat="1"/>
+    <w:lsdException w:name="Subtle Reference" w:semiHidden="0" w:uiPriority="31" w:unhideWhenUsed="0" w:qFormat="1"/>
+    <w:lsdException w:name="Intense Reference" w:semiHidden="0" w:uiPriority="32" w:unhideWhenUsed="0" w:qFormat="1"/>
+    <w:lsdException w:name="Book Title" w:semiHidden="0" w:uiPriority="33" w:unhideWhenUsed="0" w:qFormat="1"/>
+    <w:lsdException w:name="Bibliography" w:uiPriority="37"/>
+    <w:lsdException w:name="TOC Heading" w:uiPriority="39" w:qFormat="1"/>
+  </w:latentStyles>
+  <w:style w:type="paragraph" w:default="1" w:styleId="Normal">
+    <w:name w:val="Normal"/>
+    <w:qFormat/>
+  </w:style>
+  <w:style w:type="character" w:default="1" w:styleId="DefaultParagraphFont">
+    <w:name w:val="Default Paragraph Font"/>
+    <w:uiPriority w:val="1"/>
+    <w:semiHidden/>
+    <w:unhideWhenUsed/>
+  </w:style>
+  <w:style w:type="table" w:default="1" w:styleId="TableNormal">
+    <w:name w:val="Normal Table"/>
+    <w:uiPriority w:val="99"/>
+    <w:semiHidden/>
+    <w:unhideWhenUsed/>
+    <w:qFormat/>
+    <w:tblPr>
+      <w:tblInd w:w="0" w:type="dxa"/>
+      <w:tblCellMar>
+        <w:top w:w="0" w:type="dxa"/>
+        <w:left w:w="108" w:type="dxa"/>
+        <w:bottom w:w="0" w:type="dxa"/>
+        <w:right w:w="108" w:type="dxa"/>
+      </w:tblCellMar>
+    </w:tblPr>
+  </w:style>
+  <w:style w:type="numbering" w:default="1" w:styleId="NoList">
+    <w:name w:val="No List"/>
+    <w:uiPriority w:val="99"/>
+    <w:semiHidden/>
+    <w:unhideWhenUsed/>
+  </w:style>
+  <w:style w:type="paragraph" w:customStyle="1" w:styleId="661804ABD5E44D5587D0892DA3677FAE">
+    <w:name w:val="661804ABD5E44D5587D0892DA3677FAE"/>
+    <w:rsid w:val="007A6147"/>
+  </w:style>
+  <w:style w:type="paragraph" w:customStyle="1" w:styleId="BFFD11FF408748DF816DEC607C9B8E28">
+    <w:name w:val="BFFD11FF408748DF816DEC607C9B8E28"/>
+    <w:rsid w:val="007A6147"/>
+  </w:style>
+  <w:style w:type="paragraph" w:customStyle="1" w:styleId="3786EE0AB872492281E93C8DF3313847">
+    <w:name w:val="3786EE0AB872492281E93C8DF3313847"/>
+    <w:rsid w:val="007A6147"/>
+  </w:style>
+  <w:style w:type="paragraph" w:customStyle="1" w:styleId="7F90871DFBF74003A9C5D38CF834FC21">
+    <w:name w:val="7F90871DFBF74003A9C5D38CF834FC21"/>
+    <w:rsid w:val="007A6147"/>
+  </w:style>
+  <w:style w:type="paragraph" w:customStyle="1" w:styleId="8C35D953F0D442758A57F7720D14363B">
+    <w:name w:val="8C35D953F0D442758A57F7720D14363B"/>
+    <w:rsid w:val="007A6147"/>
+  </w:style>
+  <w:style w:type="paragraph" w:customStyle="1" w:styleId="7F64B2AD64114EA7B5FD54AC2C2D5493">
+    <w:name w:val="7F64B2AD64114EA7B5FD54AC2C2D5493"/>
+    <w:rsid w:val="007A6147"/>
+  </w:style>
+  <w:style w:type="paragraph" w:customStyle="1" w:styleId="3F999BE63CD04C79A55A40D73867033F">
+    <w:name w:val="3F999BE63CD04C79A55A40D73867033F"/>
+    <w:rsid w:val="007A6147"/>
+  </w:style>
+  <w:style w:type="paragraph" w:customStyle="1" w:styleId="B2DCBA94463149E38EDA242469ED7D3A">
+    <w:name w:val="B2DCBA94463149E38EDA242469ED7D3A"/>
+    <w:rsid w:val="007A6147"/>
+  </w:style>
+  <w:style w:type="paragraph" w:customStyle="1" w:styleId="024CEE8A25B342488081DE2D78E0421A">
+    <w:name w:val="024CEE8A25B342488081DE2D78E0421A"/>
+    <w:rsid w:val="007A6147"/>
+  </w:style>
+  <w:style w:type="paragraph" w:customStyle="1" w:styleId="E4D299E242E54A2CB615E73D6B9284DE">
+    <w:name w:val="E4D299E242E54A2CB615E73D6B9284DE"/>
+    <w:rsid w:val="007A6147"/>
+  </w:style>
+  <w:style w:type="paragraph" w:customStyle="1" w:styleId="E62B8A78FC0143B0869FA9EDBFC36C81">
+    <w:name w:val="E62B8A78FC0143B0869FA9EDBFC36C81"/>
+    <w:rsid w:val="007A6147"/>
+  </w:style>
+  <w:style w:type="paragraph" w:customStyle="1" w:styleId="9DB6843F6E2D4CEEBDF550437B2809AC">
+    <w:name w:val="9DB6843F6E2D4CEEBDF550437B2809AC"/>
+    <w:rsid w:val="007A6147"/>
+  </w:style>
+  <w:style w:type="paragraph" w:customStyle="1" w:styleId="7597EEE5D26149F3ACF0612946F41CD4">
+    <w:name w:val="7597EEE5D26149F3ACF0612946F41CD4"/>
+    <w:rsid w:val="007A6147"/>
+  </w:style>
+</w:styles>
+</file>
+
+<file path=word/glossary/webSettings.xml><?xml version="1.0" encoding="utf-8"?>
+<w:webSettings xmlns:r="http://schemas.openxmlformats.org/officeDocument/2006/relationships" xmlns:w="http://schemas.openxmlformats.org/wordprocessingml/2006/main">
+  <w:optimizeForBrowser/>
+</w:webSettings>
 </file>
 
 <file path=word/theme/theme1.xml><?xml version="1.0" encoding="utf-8"?>
 <a:theme xmlns:a="http://schemas.openxmlformats.org/drawingml/2006/main" name="Facet">
   <a:themeElements>
-    <a:clrScheme name="Green Yellow">
+    <a:clrScheme name="Aspect">
       <a:dk1>
         <a:sysClr val="windowText" lastClr="000000"/>
       </a:dk1>
@@ -3520,34 +4026,34 @@
         <a:sysClr val="window" lastClr="FFFFFF"/>
       </a:lt1>
       <a:dk2>
-        <a:srgbClr val="455F51"/>
+        <a:srgbClr val="323232"/>
       </a:dk2>
       <a:lt2>
-        <a:srgbClr val="E2DFCC"/>
+        <a:srgbClr val="E3DED1"/>
       </a:lt2>
       <a:accent1>
-        <a:srgbClr val="99CB38"/>
+        <a:srgbClr val="F07F09"/>
       </a:accent1>
       <a:accent2>
-        <a:srgbClr val="63A537"/>
+        <a:srgbClr val="9F2936"/>
       </a:accent2>
       <a:accent3>
-        <a:srgbClr val="37A76F"/>
+        <a:srgbClr val="1B587C"/>
       </a:accent3>
       <a:accent4>
-        <a:srgbClr val="44C1A3"/>
+        <a:srgbClr val="4E8542"/>
       </a:accent4>
       <a:accent5>
-        <a:srgbClr val="4EB3CF"/>
+        <a:srgbClr val="604878"/>
       </a:accent5>
       <a:accent6>
-        <a:srgbClr val="51C3F9"/>
+        <a:srgbClr val="C19859"/>
       </a:accent6>
       <a:hlink>
-        <a:srgbClr val="EE7B08"/>
+        <a:srgbClr val="6B9F25"/>
       </a:hlink>
       <a:folHlink>
-        <a:srgbClr val="977B2D"/>
+        <a:srgbClr val="B26B02"/>
       </a:folHlink>
     </a:clrScheme>
     <a:fontScheme name="Facet">
@@ -3760,7 +4266,7 @@
   <a:extraClrSchemeLst/>
   <a:extLst>
     <a:ext uri="{05A4C25C-085E-4340-85A3-A5531E510DB2}">
-      <thm15:themeFamily xmlns:thm15="http://schemas.microsoft.com/office/thememl/2012/main" name="Facet" id="{C0C680CD-088A-49FC-A102-D699147F32B2}" vid="{CFBC31BA-B70F-4F30-BCAA-4F3011E16C4D}"/>
+      <thm15:themeFamily xmlns:thm15="http://schemas.microsoft.com/office/thememl/2012/main" xmlns="" name="Facet" id="{C0C680CD-088A-49FC-A102-D699147F32B2}" vid="{CFBC31BA-B70F-4F30-BCAA-4F3011E16C4D}"/>
     </a:ext>
   </a:extLst>
 </a:theme>
@@ -3771,7 +4277,7 @@
 </file>
 
 <file path=customXml/itemProps1.xml><?xml version="1.0" encoding="utf-8"?>
-<ds:datastoreItem xmlns:ds="http://schemas.openxmlformats.org/officeDocument/2006/customXml" ds:itemID="{66876F4A-1C93-455D-ACB9-AF3972DAFEE9}">
+<ds:datastoreItem xmlns:ds="http://schemas.openxmlformats.org/officeDocument/2006/customXml" ds:itemID="{C56A1DE2-C6F5-42B2-BAF4-A1311021DF2E}">
   <ds:schemaRefs>
     <ds:schemaRef ds:uri="http://schemas.openxmlformats.org/officeDocument/2006/bibliography"/>
   </ds:schemaRefs>

</xml_diff>